<commit_message>
Add DOCX geneartor fo 1 and 2 types of act. Add ACtCalcualtor for calculcate Uncounted energy. Some fixes
</commit_message>
<xml_diff>
--- a/templates/act_check.docx
+++ b/templates/act_check.docx
@@ -147,7 +147,6 @@
                       <w:szCs w:val="18"/>
                     </w:rPr>
                   </w:pPr>
-                  <w:proofErr w:type="gramStart"/>
                   <w:r>
                     <w:rPr>
                       <w:b/>
@@ -155,17 +154,7 @@
                       <w:sz w:val="18"/>
                       <w:szCs w:val="18"/>
                     </w:rPr>
-                    <w:t>110010  г.</w:t>
-                  </w:r>
-                  <w:proofErr w:type="gramEnd"/>
-                  <w:r>
-                    <w:rPr>
-                      <w:b/>
-                      <w:bCs/>
-                      <w:sz w:val="18"/>
-                      <w:szCs w:val="18"/>
-                    </w:rPr>
-                    <w:t xml:space="preserve"> Костанай,</w:t>
+                    <w:t>110010  г. Костанай,</w:t>
                   </w:r>
                 </w:p>
                 <w:p>
@@ -228,26 +217,7 @@
                       <w:sz w:val="18"/>
                       <w:szCs w:val="18"/>
                     </w:rPr>
-                    <w:t>Тел. 8-7</w:t>
-                  </w:r>
-                  <w:r>
-                    <w:rPr>
-                      <w:b/>
-                      <w:bCs/>
-                      <w:sz w:val="18"/>
-                      <w:szCs w:val="18"/>
-                      <w:lang w:val="en-US"/>
-                    </w:rPr>
-                    <w:t>1</w:t>
-                  </w:r>
-                  <w:r>
-                    <w:rPr>
-                      <w:b/>
-                      <w:bCs/>
-                      <w:sz w:val="18"/>
-                      <w:szCs w:val="18"/>
-                    </w:rPr>
-                    <w:t>42-56-12-34</w:t>
+                    <w:t>Тел. 8-7142-56-12-34</w:t>
                   </w:r>
                 </w:p>
                 <w:p>
@@ -324,7 +294,6 @@
                       <w:b/>
                       <w:sz w:val="24"/>
                       <w:szCs w:val="24"/>
-                      <w:lang w:val="en-US"/>
                     </w:rPr>
                   </w:pPr>
                   <w:r>
@@ -340,7 +309,6 @@
                       <w:b/>
                       <w:sz w:val="24"/>
                       <w:szCs w:val="24"/>
-                      <w:lang w:val="en-US"/>
                     </w:rPr>
                     <w:t xml:space="preserve"> </w:t>
                   </w:r>
@@ -349,38 +317,8 @@
                       <w:b/>
                       <w:sz w:val="24"/>
                       <w:szCs w:val="24"/>
-                      <w:lang w:val="en-US"/>
                     </w:rPr>
-                    <w:t>{</w:t>
-                  </w:r>
-                  <w:r>
-                    <w:rPr>
-                      <w:b/>
-                      <w:sz w:val="24"/>
-                      <w:szCs w:val="24"/>
-                      <w:lang w:val="en-US"/>
-                    </w:rPr>
-                    <w:t>{</w:t>
-                  </w:r>
-                  <w:proofErr w:type="spellStart"/>
-                  <w:r>
-                    <w:rPr>
-                      <w:b/>
-                      <w:sz w:val="24"/>
-                      <w:szCs w:val="24"/>
-                      <w:lang w:val="en-US"/>
-                    </w:rPr>
-                    <w:t>substation_name</w:t>
-                  </w:r>
-                  <w:proofErr w:type="spellEnd"/>
-                  <w:r>
-                    <w:rPr>
-                      <w:b/>
-                      <w:sz w:val="24"/>
-                      <w:szCs w:val="24"/>
-                      <w:lang w:val="en-US"/>
-                    </w:rPr>
-                    <w:t>}}</w:t>
+                    <w:t>{{substation_name}}</w:t>
                   </w:r>
                 </w:p>
                 <w:p>
@@ -391,7 +329,6 @@
                       <w:b/>
                       <w:sz w:val="24"/>
                       <w:szCs w:val="24"/>
-                      <w:lang w:val="en-US"/>
                     </w:rPr>
                   </w:pPr>
                   <w:r>
@@ -399,29 +336,8 @@
                       <w:b/>
                       <w:sz w:val="24"/>
                       <w:szCs w:val="24"/>
-                      <w:lang w:val="en-US"/>
                     </w:rPr>
-                    <w:t>{{</w:t>
-                  </w:r>
-                  <w:proofErr w:type="spellStart"/>
-                  <w:r>
-                    <w:rPr>
-                      <w:b/>
-                      <w:sz w:val="24"/>
-                      <w:szCs w:val="24"/>
-                      <w:lang w:val="en-US"/>
-                    </w:rPr>
-                    <w:t>area_name</w:t>
-                  </w:r>
-                  <w:proofErr w:type="spellEnd"/>
-                  <w:r>
-                    <w:rPr>
-                      <w:b/>
-                      <w:sz w:val="24"/>
-                      <w:szCs w:val="24"/>
-                      <w:lang w:val="en-US"/>
-                    </w:rPr>
-                    <w:t>}}</w:t>
+                    <w:t>{{area_name}}</w:t>
                   </w:r>
                 </w:p>
                 <w:p>
@@ -432,7 +348,6 @@
                       <w:bCs/>
                       <w:sz w:val="16"/>
                       <w:szCs w:val="16"/>
-                      <w:lang w:val="en-US"/>
                     </w:rPr>
                   </w:pPr>
                 </w:p>
@@ -447,7 +362,6 @@
                 <w:bCs/>
                 <w:sz w:val="16"/>
                 <w:szCs w:val="16"/>
-                <w:lang w:val="en-US"/>
               </w:rPr>
             </w:pPr>
           </w:p>
@@ -462,7 +376,6 @@
           <w:b/>
           <w:sz w:val="24"/>
           <w:szCs w:val="24"/>
-          <w:lang w:val="en-US"/>
         </w:rPr>
       </w:pPr>
     </w:p>
@@ -474,7 +387,6 @@
           <w:b/>
           <w:sz w:val="24"/>
           <w:szCs w:val="24"/>
-          <w:lang w:val="en-US"/>
         </w:rPr>
       </w:pPr>
       <w:r>
@@ -490,29 +402,8 @@
           <w:b/>
           <w:sz w:val="24"/>
           <w:szCs w:val="24"/>
-          <w:lang w:val="en-US"/>
-        </w:rPr>
-        <w:t xml:space="preserve"> {{</w:t>
-      </w:r>
-      <w:proofErr w:type="spellStart"/>
-      <w:r>
-        <w:rPr>
-          <w:b/>
-          <w:sz w:val="24"/>
-          <w:szCs w:val="24"/>
-          <w:lang w:val="en-US"/>
-        </w:rPr>
-        <w:t>act_number</w:t>
-      </w:r>
-      <w:proofErr w:type="spellEnd"/>
-      <w:r>
-        <w:rPr>
-          <w:b/>
-          <w:sz w:val="24"/>
-          <w:szCs w:val="24"/>
-          <w:lang w:val="en-US"/>
-        </w:rPr>
-        <w:t>}}</w:t>
+        </w:rPr>
+        <w:t xml:space="preserve"> </w:t>
       </w:r>
     </w:p>
     <w:p>
@@ -555,7 +446,6 @@
         <w:rPr>
           <w:sz w:val="24"/>
           <w:szCs w:val="24"/>
-          <w:lang w:val="en-US"/>
         </w:rPr>
         <w:t>{{day}}</w:t>
       </w:r>
@@ -577,7 +467,6 @@
         <w:rPr>
           <w:sz w:val="24"/>
           <w:szCs w:val="24"/>
-          <w:lang w:val="en-US"/>
         </w:rPr>
         <w:t>{{month}} {{year}}</w:t>
       </w:r>
@@ -602,88 +491,21 @@
           <w:sz w:val="24"/>
           <w:szCs w:val="24"/>
         </w:rPr>
-        <w:t xml:space="preserve">Представитель ТОО «Межрегионэнерготранзит»  </w:t>
-      </w:r>
-      <w:r>
-        <w:rPr>
-          <w:sz w:val="24"/>
-          <w:szCs w:val="24"/>
-        </w:rPr>
-        <w:t>{{</w:t>
-      </w:r>
-      <w:r>
-        <w:rPr>
-          <w:sz w:val="24"/>
-          <w:szCs w:val="24"/>
-          <w:lang w:val="en-US"/>
-        </w:rPr>
-        <w:t>employee</w:t>
-      </w:r>
-      <w:r>
-        <w:rPr>
-          <w:sz w:val="24"/>
-          <w:szCs w:val="24"/>
-        </w:rPr>
-        <w:t>_</w:t>
-      </w:r>
-      <w:r>
-        <w:rPr>
-          <w:sz w:val="24"/>
-          <w:szCs w:val="24"/>
-          <w:lang w:val="en-US"/>
-        </w:rPr>
-        <w:t>position</w:t>
-      </w:r>
-      <w:r>
-        <w:rPr>
-          <w:sz w:val="24"/>
-          <w:szCs w:val="24"/>
-        </w:rPr>
-        <w:t>}}</w:t>
-      </w:r>
-      <w:r>
-        <w:rPr>
-          <w:sz w:val="24"/>
-          <w:szCs w:val="24"/>
-        </w:rPr>
-        <w:t xml:space="preserve"> </w:t>
-      </w:r>
-      <w:r>
-        <w:rPr>
-          <w:sz w:val="24"/>
-          <w:szCs w:val="24"/>
-        </w:rPr>
-        <w:t>{{</w:t>
-      </w:r>
-      <w:r>
-        <w:rPr>
-          <w:sz w:val="24"/>
-          <w:szCs w:val="24"/>
-          <w:lang w:val="en-US"/>
-        </w:rPr>
-        <w:t>employee</w:t>
-      </w:r>
-      <w:r>
-        <w:rPr>
-          <w:sz w:val="24"/>
-          <w:szCs w:val="24"/>
-        </w:rPr>
-        <w:t>_</w:t>
-      </w:r>
-      <w:r>
-        <w:rPr>
-          <w:sz w:val="24"/>
-          <w:szCs w:val="24"/>
-          <w:lang w:val="en-US"/>
-        </w:rPr>
-        <w:t>name</w:t>
-      </w:r>
-      <w:r>
-        <w:rPr>
-          <w:sz w:val="24"/>
-          <w:szCs w:val="24"/>
-        </w:rPr>
-        <w:t>}}</w:t>
+        <w:t>{{#with_representatives}}</w:t>
+      </w:r>
+      <w:r>
+        <w:rPr>
+          <w:sz w:val="24"/>
+          <w:szCs w:val="24"/>
+        </w:rPr>
+        <w:t>Представитель ТОО «Межрегионэнерготранзит» {{employee_position}} {{employee_name}}</w:t>
+      </w:r>
+      <w:r>
+        <w:rPr>
+          <w:sz w:val="24"/>
+          <w:szCs w:val="24"/>
+        </w:rPr>
+        <w:t>{{/with_representatives}}</w:t>
       </w:r>
     </w:p>
     <w:p>
@@ -692,7 +514,6 @@
         <w:rPr>
           <w:sz w:val="24"/>
           <w:szCs w:val="24"/>
-          <w:lang w:val="en-US"/>
         </w:rPr>
       </w:pPr>
       <w:r>
@@ -700,189 +521,21 @@
           <w:sz w:val="24"/>
           <w:szCs w:val="24"/>
         </w:rPr>
-        <w:t>В</w:t>
-      </w:r>
-      <w:r>
-        <w:rPr>
-          <w:sz w:val="24"/>
-          <w:szCs w:val="24"/>
-          <w:lang w:val="en-US"/>
-        </w:rPr>
-        <w:t xml:space="preserve"> </w:t>
-      </w:r>
-      <w:r>
-        <w:rPr>
-          <w:sz w:val="24"/>
-          <w:szCs w:val="24"/>
-        </w:rPr>
-        <w:t>присутствии</w:t>
-      </w:r>
-      <w:r>
-        <w:rPr>
-          <w:sz w:val="24"/>
-          <w:szCs w:val="24"/>
-          <w:lang w:val="en-US"/>
-        </w:rPr>
-        <w:t xml:space="preserve"> </w:t>
-      </w:r>
-      <w:r>
-        <w:rPr>
-          <w:sz w:val="24"/>
-          <w:szCs w:val="24"/>
-        </w:rPr>
-        <w:t>представителей</w:t>
-      </w:r>
-      <w:r>
-        <w:rPr>
-          <w:sz w:val="24"/>
-          <w:szCs w:val="24"/>
-          <w:lang w:val="en-US"/>
-        </w:rPr>
-        <w:t xml:space="preserve">: </w:t>
-      </w:r>
-      <w:r>
-        <w:rPr>
-          <w:sz w:val="24"/>
-          <w:szCs w:val="24"/>
-          <w:lang w:val="en-US"/>
-        </w:rPr>
-        <w:t xml:space="preserve">{{#representatives_top}} </w:t>
-      </w:r>
-      <w:r>
-        <w:rPr>
-          <w:sz w:val="24"/>
-          <w:szCs w:val="24"/>
-          <w:lang w:val="en-US"/>
-        </w:rPr>
-        <w:t>{{</w:t>
-      </w:r>
-      <w:proofErr w:type="spellStart"/>
-      <w:r>
-        <w:rPr>
-          <w:sz w:val="24"/>
-          <w:szCs w:val="24"/>
-          <w:lang w:val="en-US"/>
-        </w:rPr>
-        <w:t>representative</w:t>
-      </w:r>
-      <w:r>
-        <w:rPr>
-          <w:sz w:val="24"/>
-          <w:szCs w:val="24"/>
-          <w:lang w:val="en-US"/>
-        </w:rPr>
-        <w:t>_</w:t>
-      </w:r>
-      <w:r>
-        <w:rPr>
-          <w:sz w:val="24"/>
-          <w:szCs w:val="24"/>
-          <w:lang w:val="en-US"/>
-        </w:rPr>
-        <w:t>organization</w:t>
-      </w:r>
-      <w:proofErr w:type="spellEnd"/>
-      <w:r>
-        <w:rPr>
-          <w:sz w:val="24"/>
-          <w:szCs w:val="24"/>
-          <w:lang w:val="en-US"/>
-        </w:rPr>
-        <w:t>}}</w:t>
-      </w:r>
-      <w:r>
-        <w:rPr>
-          <w:sz w:val="24"/>
-          <w:szCs w:val="24"/>
-          <w:lang w:val="en-US"/>
-        </w:rPr>
-        <w:t xml:space="preserve"> </w:t>
-      </w:r>
-      <w:r>
-        <w:rPr>
-          <w:sz w:val="24"/>
-          <w:szCs w:val="24"/>
-          <w:lang w:val="en-US"/>
-        </w:rPr>
-        <w:t>{{</w:t>
-      </w:r>
-      <w:proofErr w:type="spellStart"/>
-      <w:r>
-        <w:rPr>
-          <w:sz w:val="24"/>
-          <w:szCs w:val="24"/>
-          <w:lang w:val="en-US"/>
-        </w:rPr>
-        <w:t>representative</w:t>
-      </w:r>
-      <w:r>
-        <w:rPr>
-          <w:sz w:val="24"/>
-          <w:szCs w:val="24"/>
-          <w:lang w:val="en-US"/>
-        </w:rPr>
-        <w:t>_</w:t>
-      </w:r>
-      <w:r>
-        <w:rPr>
-          <w:sz w:val="24"/>
-          <w:szCs w:val="24"/>
-          <w:lang w:val="en-US"/>
-        </w:rPr>
-        <w:t>position</w:t>
-      </w:r>
-      <w:proofErr w:type="spellEnd"/>
-      <w:r>
-        <w:rPr>
-          <w:sz w:val="24"/>
-          <w:szCs w:val="24"/>
-          <w:lang w:val="en-US"/>
-        </w:rPr>
-        <w:t>}} {{</w:t>
-      </w:r>
-      <w:proofErr w:type="spellStart"/>
-      <w:r>
-        <w:rPr>
-          <w:sz w:val="24"/>
-          <w:szCs w:val="24"/>
-          <w:lang w:val="en-US"/>
-        </w:rPr>
-        <w:t>representative_name</w:t>
-      </w:r>
-      <w:proofErr w:type="spellEnd"/>
-      <w:r>
-        <w:rPr>
-          <w:sz w:val="24"/>
-          <w:szCs w:val="24"/>
-          <w:lang w:val="en-US"/>
-        </w:rPr>
-        <w:t>}}</w:t>
-      </w:r>
-      <w:r>
-        <w:rPr>
-          <w:sz w:val="24"/>
-          <w:szCs w:val="24"/>
-          <w:lang w:val="en-US"/>
-        </w:rPr>
-        <w:t xml:space="preserve"> {{/</w:t>
-      </w:r>
-      <w:proofErr w:type="spellStart"/>
-      <w:r>
-        <w:rPr>
-          <w:sz w:val="24"/>
-          <w:szCs w:val="24"/>
-          <w:lang w:val="en-US"/>
-        </w:rPr>
-        <w:t>representatives_top</w:t>
-      </w:r>
-      <w:proofErr w:type="spellEnd"/>
-      <w:r>
-        <w:rPr>
-          <w:sz w:val="24"/>
-          <w:szCs w:val="24"/>
-          <w:lang w:val="en-US"/>
-        </w:rPr>
-        <w:t>}}</w:t>
+        <w:t>{{#with_representatives}}</w:t>
+      </w:r>
+      <w:r>
+        <w:rPr>
+          <w:sz w:val="24"/>
+          <w:szCs w:val="24"/>
+        </w:rPr>
+        <w:t>В присутствии представителей:</w:t>
+      </w:r>
+      <w:r>
+        <w:rPr>
+          <w:sz w:val="24"/>
+          <w:szCs w:val="24"/>
+        </w:rPr>
+        <w:t xml:space="preserve"> {{/with_representatives}}</w:t>
       </w:r>
     </w:p>
     <w:p>
@@ -898,95 +551,22 @@
           <w:sz w:val="24"/>
           <w:szCs w:val="24"/>
         </w:rPr>
-        <w:t xml:space="preserve">Произведена </w:t>
-      </w:r>
-      <w:r>
-        <w:rPr>
-          <w:sz w:val="24"/>
-          <w:szCs w:val="24"/>
-        </w:rPr>
-        <w:t>планова</w:t>
-      </w:r>
-      <w:r>
-        <w:rPr>
-          <w:sz w:val="24"/>
-          <w:szCs w:val="24"/>
-        </w:rPr>
-        <w:t>я</w:t>
-      </w:r>
-      <w:r>
-        <w:rPr>
-          <w:sz w:val="24"/>
-          <w:szCs w:val="24"/>
-        </w:rPr>
-        <w:t>/</w:t>
-      </w:r>
-      <w:r>
-        <w:rPr>
-          <w:sz w:val="24"/>
-          <w:szCs w:val="24"/>
-        </w:rPr>
-        <w:t>внеплановая</w:t>
-      </w:r>
-      <w:r>
-        <w:rPr>
-          <w:sz w:val="24"/>
-          <w:szCs w:val="24"/>
-        </w:rPr>
-        <w:t xml:space="preserve"> </w:t>
-      </w:r>
-      <w:r>
-        <w:rPr>
-          <w:sz w:val="24"/>
-          <w:szCs w:val="24"/>
-        </w:rPr>
-        <w:t>проверка прибора учета</w:t>
-      </w:r>
-      <w:r>
-        <w:rPr>
-          <w:sz w:val="24"/>
-          <w:szCs w:val="24"/>
-        </w:rPr>
-        <w:t xml:space="preserve"> на стороне </w:t>
-      </w:r>
-      <w:r>
-        <w:rPr>
-          <w:sz w:val="24"/>
-          <w:szCs w:val="24"/>
-        </w:rPr>
-        <w:t>{{</w:t>
-      </w:r>
-      <w:r>
-        <w:rPr>
-          <w:sz w:val="24"/>
-          <w:szCs w:val="24"/>
-          <w:lang w:val="en-US"/>
-        </w:rPr>
-        <w:t>voltage</w:t>
-      </w:r>
-      <w:r>
-        <w:rPr>
-          <w:sz w:val="24"/>
-          <w:szCs w:val="24"/>
-        </w:rPr>
-        <w:t>}}</w:t>
-      </w:r>
-      <w:r>
-        <w:rPr>
-          <w:sz w:val="24"/>
-          <w:szCs w:val="24"/>
-        </w:rPr>
-        <w:t xml:space="preserve"> </w:t>
-      </w:r>
-      <w:proofErr w:type="spellStart"/>
-      <w:r>
-        <w:rPr>
-          <w:sz w:val="24"/>
-          <w:szCs w:val="24"/>
-        </w:rPr>
-        <w:t>кВ.</w:t>
-      </w:r>
-      <w:proofErr w:type="spellEnd"/>
+        <w:t>{{#representatives_top}}</w:t>
+      </w:r>
+      <w:r>
+        <w:rPr>
+          <w:sz w:val="24"/>
+          <w:szCs w:val="24"/>
+        </w:rPr>
+        <w:t>{{representative_organization}} {{representative_position}} {{representative_name}}</w:t>
+      </w:r>
+      <w:r>
+        <w:rPr>
+          <w:sz w:val="24"/>
+          <w:szCs w:val="24"/>
+        </w:rPr>
+        <w:t>{{/representatives_top}}</w:t>
+      </w:r>
     </w:p>
     <w:p>
       <w:pPr>
@@ -1001,25 +581,85 @@
           <w:sz w:val="24"/>
           <w:szCs w:val="24"/>
         </w:rPr>
-        <w:t>Проверка приборов учета производилась средствами измерений:</w:t>
-      </w:r>
-      <w:r>
-        <w:rPr>
-          <w:sz w:val="24"/>
-          <w:szCs w:val="24"/>
-        </w:rPr>
-        <w:t xml:space="preserve"> ВАФ-ПАРМА.</w:t>
+        <w:t xml:space="preserve">Произведена </w:t>
+      </w:r>
+      <w:r>
+        <w:rPr>
+          <w:sz w:val="24"/>
+          <w:szCs w:val="24"/>
+        </w:rPr>
+        <w:t>{{work_schedule_type}}</w:t>
+      </w:r>
+      <w:r>
+        <w:rPr>
+          <w:sz w:val="24"/>
+          <w:szCs w:val="24"/>
+        </w:rPr>
+        <w:t xml:space="preserve"> </w:t>
+      </w:r>
+      <w:r>
+        <w:rPr>
+          <w:sz w:val="24"/>
+          <w:szCs w:val="24"/>
+        </w:rPr>
+        <w:t>проверка прибора учета</w:t>
+      </w:r>
+      <w:r>
+        <w:rPr>
+          <w:sz w:val="24"/>
+          <w:szCs w:val="24"/>
+        </w:rPr>
+        <w:t xml:space="preserve"> на стороне </w:t>
+      </w:r>
+      <w:r>
+        <w:rPr>
+          <w:sz w:val="24"/>
+          <w:szCs w:val="24"/>
+        </w:rPr>
+        <w:t>{{voltage}}</w:t>
+      </w:r>
+      <w:r>
+        <w:rPr>
+          <w:sz w:val="24"/>
+          <w:szCs w:val="24"/>
+        </w:rPr>
+        <w:t>кВ.</w:t>
       </w:r>
     </w:p>
     <w:p>
       <w:pPr>
         <w:spacing w:line="300" w:lineRule="auto"/>
         <w:rPr>
+          <w:sz w:val="24"/>
+          <w:szCs w:val="24"/>
+        </w:rPr>
+      </w:pPr>
+      <w:r>
+        <w:rPr>
+          <w:sz w:val="24"/>
+          <w:szCs w:val="24"/>
+        </w:rPr>
+        <w:t>Проверка приборов учета производилась средствами измерений:</w:t>
+      </w:r>
+      <w:r>
+        <w:rPr>
+          <w:sz w:val="24"/>
+          <w:szCs w:val="24"/>
+        </w:rPr>
+        <w:t xml:space="preserve"> ВАФ-ПАРМА.</w:t>
+      </w:r>
+    </w:p>
+    <w:p>
+      <w:pPr>
+        <w:tabs>
+          <w:tab w:val="left" w:pos="5670"/>
+        </w:tabs>
+        <w:spacing w:line="300" w:lineRule="auto"/>
+        <w:rPr>
           <w:b/>
           <w:bCs/>
           <w:sz w:val="24"/>
           <w:szCs w:val="24"/>
-          <w:lang w:val="en-US"/>
         </w:rPr>
       </w:pPr>
       <w:r>
@@ -1027,29 +667,8 @@
           <w:b/>
           <w:sz w:val="24"/>
           <w:szCs w:val="24"/>
-          <w:lang w:val="en-US"/>
-        </w:rPr>
-        <w:t>{{</w:t>
-      </w:r>
-      <w:proofErr w:type="spellStart"/>
-      <w:r>
-        <w:rPr>
-          <w:b/>
-          <w:sz w:val="24"/>
-          <w:szCs w:val="24"/>
-          <w:lang w:val="en-US"/>
-        </w:rPr>
-        <w:t>connection_name</w:t>
-      </w:r>
-      <w:proofErr w:type="spellEnd"/>
-      <w:r>
-        <w:rPr>
-          <w:b/>
-          <w:sz w:val="24"/>
-          <w:szCs w:val="24"/>
-          <w:lang w:val="en-US"/>
-        </w:rPr>
-        <w:t>}}</w:t>
+        </w:rPr>
+        <w:t>{{connection_name}}</w:t>
       </w:r>
       <w:r>
         <w:rPr>
@@ -1057,9 +676,9 @@
           <w:bCs/>
           <w:sz w:val="24"/>
           <w:szCs w:val="24"/>
-          <w:lang w:val="en-US"/>
         </w:rPr>
         <w:tab/>
+        <w:t>Ктт=</w:t>
       </w:r>
       <w:r>
         <w:rPr>
@@ -1067,82 +686,8 @@
           <w:bCs/>
           <w:sz w:val="24"/>
           <w:szCs w:val="24"/>
-          <w:lang w:val="en-US"/>
-        </w:rPr>
-        <w:tab/>
-      </w:r>
-      <w:r>
-        <w:rPr>
-          <w:b/>
-          <w:bCs/>
-          <w:sz w:val="24"/>
-          <w:szCs w:val="24"/>
-          <w:lang w:val="en-US"/>
-        </w:rPr>
-        <w:tab/>
-      </w:r>
-      <w:r>
-        <w:rPr>
-          <w:b/>
-          <w:bCs/>
-          <w:sz w:val="24"/>
-          <w:szCs w:val="24"/>
-          <w:lang w:val="en-US"/>
-        </w:rPr>
-        <w:tab/>
-      </w:r>
-      <w:proofErr w:type="spellStart"/>
-      <w:r>
-        <w:rPr>
-          <w:b/>
-          <w:bCs/>
-          <w:sz w:val="24"/>
-          <w:szCs w:val="24"/>
-        </w:rPr>
-        <w:t>Ктт</w:t>
-      </w:r>
-      <w:proofErr w:type="spellEnd"/>
-      <w:r>
-        <w:rPr>
-          <w:b/>
-          <w:bCs/>
-          <w:sz w:val="24"/>
-          <w:szCs w:val="24"/>
-          <w:lang w:val="en-US"/>
-        </w:rPr>
-        <w:t>=</w:t>
-      </w:r>
-      <w:r>
-        <w:rPr>
-          <w:b/>
-          <w:bCs/>
-          <w:sz w:val="24"/>
-          <w:szCs w:val="24"/>
-          <w:lang w:val="en-US"/>
-        </w:rPr>
-        <w:t>{{</w:t>
-      </w:r>
-      <w:proofErr w:type="spellStart"/>
-      <w:r>
-        <w:rPr>
-          <w:b/>
-          <w:bCs/>
-          <w:sz w:val="24"/>
-          <w:szCs w:val="24"/>
-          <w:lang w:val="en-US"/>
-        </w:rPr>
-        <w:t>ct_ratio</w:t>
-      </w:r>
-      <w:proofErr w:type="spellEnd"/>
-      <w:r>
-        <w:rPr>
-          <w:b/>
-          <w:bCs/>
-          <w:sz w:val="24"/>
-          <w:szCs w:val="24"/>
-          <w:lang w:val="en-US"/>
-        </w:rPr>
-        <w:t>}}</w:t>
+        </w:rPr>
+        <w:t>{{ct_ratio}}</w:t>
       </w:r>
     </w:p>
     <w:tbl>
@@ -1324,29 +869,9 @@
           <w:p>
             <w:pPr>
               <w:jc w:val="center"/>
-              <w:rPr>
-                <w:lang w:val="en-US"/>
-              </w:rPr>
             </w:pPr>
             <w:r>
-              <w:rPr>
-                <w:lang w:val="en-US"/>
-              </w:rPr>
-              <w:t>{{</w:t>
-            </w:r>
-            <w:proofErr w:type="spellStart"/>
-            <w:r>
-              <w:rPr>
-                <w:lang w:val="en-US"/>
-              </w:rPr>
-              <w:t>meter_name</w:t>
-            </w:r>
-            <w:proofErr w:type="spellEnd"/>
-            <w:r>
-              <w:rPr>
-                <w:lang w:val="en-US"/>
-              </w:rPr>
-              <w:t>}}</w:t>
+              <w:t>{{meter_name}}</w:t>
             </w:r>
           </w:p>
         </w:tc>
@@ -1366,29 +891,9 @@
           <w:p>
             <w:pPr>
               <w:jc w:val="center"/>
-              <w:rPr>
-                <w:lang w:val="en-US"/>
-              </w:rPr>
             </w:pPr>
             <w:r>
-              <w:rPr>
-                <w:lang w:val="en-US"/>
-              </w:rPr>
-              <w:t>{{</w:t>
-            </w:r>
-            <w:proofErr w:type="spellStart"/>
-            <w:r>
-              <w:rPr>
-                <w:lang w:val="en-US"/>
-              </w:rPr>
-              <w:t>meter_serial</w:t>
-            </w:r>
-            <w:proofErr w:type="spellEnd"/>
-            <w:r>
-              <w:rPr>
-                <w:lang w:val="en-US"/>
-              </w:rPr>
-              <w:t>}}</w:t>
+              <w:t>{{meter_serial}}</w:t>
             </w:r>
           </w:p>
         </w:tc>
@@ -1435,34 +940,14 @@
               <w:rPr>
                 <w:sz w:val="22"/>
                 <w:szCs w:val="22"/>
-                <w:lang w:val="en-US"/>
               </w:rPr>
             </w:pPr>
             <w:r>
               <w:rPr>
                 <w:sz w:val="22"/>
                 <w:szCs w:val="22"/>
-                <w:lang w:val="en-US"/>
-              </w:rPr>
-              <w:t>{{</w:t>
-            </w:r>
-            <w:proofErr w:type="spellStart"/>
-            <w:r>
-              <w:rPr>
-                <w:sz w:val="22"/>
-                <w:szCs w:val="22"/>
-                <w:lang w:val="en-US"/>
-              </w:rPr>
-              <w:t>reading_a_plus</w:t>
-            </w:r>
-            <w:proofErr w:type="spellEnd"/>
-            <w:r>
-              <w:rPr>
-                <w:sz w:val="22"/>
-                <w:szCs w:val="22"/>
-                <w:lang w:val="en-US"/>
-              </w:rPr>
-              <w:t>}}</w:t>
+              </w:rPr>
+              <w:t>{{reading_a_plus}}</w:t>
             </w:r>
           </w:p>
         </w:tc>
@@ -1482,14 +967,8 @@
           <w:p>
             <w:pPr>
               <w:jc w:val="center"/>
-              <w:rPr>
-                <w:lang w:val="en-US"/>
-              </w:rPr>
             </w:pPr>
             <w:r>
-              <w:rPr>
-                <w:lang w:val="en-US"/>
-              </w:rPr>
               <w:t>{{accuracy}}</w:t>
             </w:r>
           </w:p>
@@ -1510,14 +989,8 @@
           <w:p>
             <w:pPr>
               <w:jc w:val="center"/>
-              <w:rPr>
-                <w:lang w:val="en-US"/>
-              </w:rPr>
             </w:pPr>
             <w:r>
-              <w:rPr>
-                <w:lang w:val="en-US"/>
-              </w:rPr>
               <w:t>{{verify}}</w:t>
             </w:r>
           </w:p>
@@ -1600,34 +1073,14 @@
               <w:rPr>
                 <w:sz w:val="22"/>
                 <w:szCs w:val="22"/>
-                <w:lang w:val="en-US"/>
               </w:rPr>
             </w:pPr>
             <w:r>
               <w:rPr>
                 <w:sz w:val="22"/>
                 <w:szCs w:val="22"/>
-                <w:lang w:val="en-US"/>
-              </w:rPr>
-              <w:t>{{</w:t>
-            </w:r>
-            <w:proofErr w:type="spellStart"/>
-            <w:r>
-              <w:rPr>
-                <w:sz w:val="22"/>
-                <w:szCs w:val="22"/>
-                <w:lang w:val="en-US"/>
-              </w:rPr>
-              <w:t>reading_a_minus</w:t>
-            </w:r>
-            <w:proofErr w:type="spellEnd"/>
-            <w:r>
-              <w:rPr>
-                <w:sz w:val="22"/>
-                <w:szCs w:val="22"/>
-                <w:lang w:val="en-US"/>
-              </w:rPr>
-              <w:t>}}</w:t>
+              </w:rPr>
+              <w:t>{{reading_a_minus}}</w:t>
             </w:r>
           </w:p>
         </w:tc>
@@ -1644,13 +1097,7 @@
             <w:vAlign w:val="center"/>
             <w:hideMark/>
           </w:tcPr>
-          <w:p>
-            <w:pPr>
-              <w:rPr>
-                <w:lang w:val="en-US"/>
-              </w:rPr>
-            </w:pPr>
-          </w:p>
+          <w:p/>
         </w:tc>
         <w:tc>
           <w:tcPr>
@@ -1724,63 +1171,35 @@
               <w:rPr>
                 <w:sz w:val="22"/>
                 <w:szCs w:val="22"/>
-                <w:lang w:val="en-US"/>
-              </w:rPr>
-              <w:t>R</w:t>
-            </w:r>
-            <w:r>
+              </w:rPr>
+              <w:t>R(отд.)</w:t>
+            </w:r>
+          </w:p>
+        </w:tc>
+        <w:tc>
+          <w:tcPr>
+            <w:tcW w:w="817" w:type="pct"/>
+            <w:tcBorders>
+              <w:top w:val="single" w:sz="4" w:space="0" w:color="auto"/>
+              <w:left w:val="nil"/>
+              <w:bottom w:val="single" w:sz="4" w:space="0" w:color="auto"/>
+              <w:right w:val="single" w:sz="4" w:space="0" w:color="auto"/>
+            </w:tcBorders>
+            <w:hideMark/>
+          </w:tcPr>
+          <w:p>
+            <w:pPr>
               <w:rPr>
                 <w:sz w:val="22"/>
                 <w:szCs w:val="22"/>
               </w:rPr>
-              <w:t>(отд.)</w:t>
-            </w:r>
-          </w:p>
-        </w:tc>
-        <w:tc>
-          <w:tcPr>
-            <w:tcW w:w="817" w:type="pct"/>
-            <w:tcBorders>
-              <w:top w:val="single" w:sz="4" w:space="0" w:color="auto"/>
-              <w:left w:val="nil"/>
-              <w:bottom w:val="single" w:sz="4" w:space="0" w:color="auto"/>
-              <w:right w:val="single" w:sz="4" w:space="0" w:color="auto"/>
-            </w:tcBorders>
-            <w:hideMark/>
-          </w:tcPr>
-          <w:p>
-            <w:pPr>
+            </w:pPr>
+            <w:r>
               <w:rPr>
                 <w:sz w:val="22"/>
                 <w:szCs w:val="22"/>
-                <w:lang w:val="en-US"/>
-              </w:rPr>
-            </w:pPr>
-            <w:r>
-              <w:rPr>
-                <w:sz w:val="22"/>
-                <w:szCs w:val="22"/>
-                <w:lang w:val="en-US"/>
-              </w:rPr>
-              <w:t>{{</w:t>
-            </w:r>
-            <w:proofErr w:type="spellStart"/>
-            <w:r>
-              <w:rPr>
-                <w:sz w:val="22"/>
-                <w:szCs w:val="22"/>
-                <w:lang w:val="en-US"/>
-              </w:rPr>
-              <w:t>reading_r_plus</w:t>
-            </w:r>
-            <w:proofErr w:type="spellEnd"/>
-            <w:r>
-              <w:rPr>
-                <w:sz w:val="22"/>
-                <w:szCs w:val="22"/>
-                <w:lang w:val="en-US"/>
-              </w:rPr>
-              <w:t>}}</w:t>
+              </w:rPr>
+              <w:t>{{reading_r_plus}}</w:t>
             </w:r>
           </w:p>
         </w:tc>
@@ -1797,13 +1216,7 @@
             <w:vAlign w:val="center"/>
             <w:hideMark/>
           </w:tcPr>
-          <w:p>
-            <w:pPr>
-              <w:rPr>
-                <w:lang w:val="en-US"/>
-              </w:rPr>
-            </w:pPr>
-          </w:p>
+          <w:p/>
         </w:tc>
         <w:tc>
           <w:tcPr>
@@ -1877,63 +1290,35 @@
               <w:rPr>
                 <w:sz w:val="22"/>
                 <w:szCs w:val="22"/>
-                <w:lang w:val="en-US"/>
-              </w:rPr>
-              <w:t>R</w:t>
-            </w:r>
-            <w:r>
+              </w:rPr>
+              <w:t>R(пр.)</w:t>
+            </w:r>
+          </w:p>
+        </w:tc>
+        <w:tc>
+          <w:tcPr>
+            <w:tcW w:w="817" w:type="pct"/>
+            <w:tcBorders>
+              <w:top w:val="single" w:sz="4" w:space="0" w:color="auto"/>
+              <w:left w:val="nil"/>
+              <w:bottom w:val="single" w:sz="4" w:space="0" w:color="auto"/>
+              <w:right w:val="single" w:sz="4" w:space="0" w:color="auto"/>
+            </w:tcBorders>
+            <w:hideMark/>
+          </w:tcPr>
+          <w:p>
+            <w:pPr>
               <w:rPr>
                 <w:sz w:val="22"/>
                 <w:szCs w:val="22"/>
               </w:rPr>
-              <w:t>(пр.)</w:t>
-            </w:r>
-          </w:p>
-        </w:tc>
-        <w:tc>
-          <w:tcPr>
-            <w:tcW w:w="817" w:type="pct"/>
-            <w:tcBorders>
-              <w:top w:val="single" w:sz="4" w:space="0" w:color="auto"/>
-              <w:left w:val="nil"/>
-              <w:bottom w:val="single" w:sz="4" w:space="0" w:color="auto"/>
-              <w:right w:val="single" w:sz="4" w:space="0" w:color="auto"/>
-            </w:tcBorders>
-            <w:hideMark/>
-          </w:tcPr>
-          <w:p>
-            <w:pPr>
+            </w:pPr>
+            <w:r>
               <w:rPr>
                 <w:sz w:val="22"/>
                 <w:szCs w:val="22"/>
-                <w:lang w:val="en-US"/>
-              </w:rPr>
-            </w:pPr>
-            <w:r>
-              <w:rPr>
-                <w:sz w:val="22"/>
-                <w:szCs w:val="22"/>
-                <w:lang w:val="en-US"/>
-              </w:rPr>
-              <w:t>{{</w:t>
-            </w:r>
-            <w:proofErr w:type="spellStart"/>
-            <w:r>
-              <w:rPr>
-                <w:sz w:val="22"/>
-                <w:szCs w:val="22"/>
-                <w:lang w:val="en-US"/>
-              </w:rPr>
-              <w:t>reading_r_minus</w:t>
-            </w:r>
-            <w:proofErr w:type="spellEnd"/>
-            <w:r>
-              <w:rPr>
-                <w:sz w:val="22"/>
-                <w:szCs w:val="22"/>
-                <w:lang w:val="en-US"/>
-              </w:rPr>
-              <w:t>}}</w:t>
+              </w:rPr>
+              <w:t>{{reading_r_minus}}</w:t>
             </w:r>
           </w:p>
         </w:tc>
@@ -1950,13 +1335,7 @@
             <w:vAlign w:val="center"/>
             <w:hideMark/>
           </w:tcPr>
-          <w:p>
-            <w:pPr>
-              <w:rPr>
-                <w:lang w:val="en-US"/>
-              </w:rPr>
-            </w:pPr>
-          </w:p>
+          <w:p/>
         </w:tc>
         <w:tc>
           <w:tcPr>
@@ -1983,6 +1362,23 @@
           <w:szCs w:val="24"/>
         </w:rPr>
       </w:pPr>
+    </w:p>
+    <w:p>
+      <w:pPr>
+        <w:rPr>
+          <w:bCs/>
+          <w:sz w:val="24"/>
+          <w:szCs w:val="24"/>
+        </w:rPr>
+      </w:pPr>
+      <w:r>
+        <w:rPr>
+          <w:bCs/>
+          <w:sz w:val="24"/>
+          <w:szCs w:val="24"/>
+        </w:rPr>
+        <w:t>{{#vector_diagram}}</w:t>
+      </w:r>
     </w:p>
     <w:p>
       <w:pPr>
@@ -2050,29 +1446,12 @@
                 <w:szCs w:val="24"/>
               </w:rPr>
             </w:pPr>
-            <w:proofErr w:type="gramStart"/>
-            <w:r>
-              <w:rPr>
-                <w:sz w:val="24"/>
-                <w:szCs w:val="24"/>
-              </w:rPr>
-              <w:t>ф.</w:t>
-            </w:r>
-            <w:r>
-              <w:rPr>
-                <w:sz w:val="24"/>
-                <w:szCs w:val="24"/>
-                <w:lang w:val="en-US"/>
-              </w:rPr>
-              <w:t>I</w:t>
-            </w:r>
-            <w:proofErr w:type="gramEnd"/>
-            <w:r>
-              <w:rPr>
-                <w:sz w:val="24"/>
-                <w:szCs w:val="24"/>
-              </w:rPr>
-              <w:t>а</w:t>
+            <w:r>
+              <w:rPr>
+                <w:sz w:val="24"/>
+                <w:szCs w:val="24"/>
+              </w:rPr>
+              <w:t>ф.Iа</w:t>
             </w:r>
           </w:p>
         </w:tc>
@@ -2097,29 +1476,12 @@
                 <w:szCs w:val="24"/>
               </w:rPr>
             </w:pPr>
-            <w:proofErr w:type="gramStart"/>
-            <w:r>
-              <w:rPr>
-                <w:sz w:val="24"/>
-                <w:szCs w:val="24"/>
-              </w:rPr>
-              <w:t>ф.</w:t>
-            </w:r>
-            <w:r>
-              <w:rPr>
-                <w:sz w:val="24"/>
-                <w:szCs w:val="24"/>
-                <w:lang w:val="en-US"/>
-              </w:rPr>
-              <w:t>I</w:t>
-            </w:r>
-            <w:proofErr w:type="gramEnd"/>
-            <w:r>
-              <w:rPr>
-                <w:sz w:val="24"/>
-                <w:szCs w:val="24"/>
-              </w:rPr>
-              <w:t>в</w:t>
+            <w:r>
+              <w:rPr>
+                <w:sz w:val="24"/>
+                <w:szCs w:val="24"/>
+              </w:rPr>
+              <w:t>ф.Iв</w:t>
             </w:r>
           </w:p>
         </w:tc>
@@ -2144,29 +1506,12 @@
                 <w:szCs w:val="24"/>
               </w:rPr>
             </w:pPr>
-            <w:proofErr w:type="gramStart"/>
-            <w:r>
-              <w:rPr>
-                <w:sz w:val="24"/>
-                <w:szCs w:val="24"/>
-              </w:rPr>
-              <w:t>ф.</w:t>
-            </w:r>
-            <w:r>
-              <w:rPr>
-                <w:sz w:val="24"/>
-                <w:szCs w:val="24"/>
-                <w:lang w:val="en-US"/>
-              </w:rPr>
-              <w:t>I</w:t>
-            </w:r>
-            <w:proofErr w:type="gramEnd"/>
-            <w:r>
-              <w:rPr>
-                <w:sz w:val="24"/>
-                <w:szCs w:val="24"/>
-              </w:rPr>
-              <w:t>с</w:t>
+            <w:r>
+              <w:rPr>
+                <w:sz w:val="24"/>
+                <w:szCs w:val="24"/>
+              </w:rPr>
+              <w:t>ф.Iс</w:t>
             </w:r>
           </w:p>
         </w:tc>
@@ -2192,49 +1537,21 @@
               <w:rPr>
                 <w:sz w:val="24"/>
                 <w:szCs w:val="24"/>
-                <w:lang w:val="en-US"/>
               </w:rPr>
             </w:pPr>
             <w:r>
               <w:rPr>
                 <w:sz w:val="24"/>
                 <w:szCs w:val="24"/>
-                <w:lang w:val="en-US"/>
-              </w:rPr>
-              <w:t>I</w:t>
-            </w:r>
-            <w:r>
-              <w:rPr>
-                <w:sz w:val="24"/>
-                <w:szCs w:val="24"/>
-              </w:rPr>
-              <w:t xml:space="preserve">= </w:t>
-            </w:r>
-            <w:r>
-              <w:rPr>
-                <w:sz w:val="24"/>
-                <w:szCs w:val="24"/>
-                <w:lang w:val="en-US"/>
-              </w:rPr>
-              <w:t>{{</w:t>
-            </w:r>
-            <w:proofErr w:type="spellStart"/>
-            <w:r>
-              <w:rPr>
-                <w:sz w:val="24"/>
-                <w:szCs w:val="24"/>
-                <w:lang w:val="en-US"/>
-              </w:rPr>
-              <w:t>ia</w:t>
-            </w:r>
-            <w:proofErr w:type="spellEnd"/>
-            <w:r>
-              <w:rPr>
-                <w:sz w:val="24"/>
-                <w:szCs w:val="24"/>
-                <w:lang w:val="en-US"/>
-              </w:rPr>
-              <w:t>}}</w:t>
+              </w:rPr>
+              <w:t xml:space="preserve">I= </w:t>
+            </w:r>
+            <w:r>
+              <w:rPr>
+                <w:sz w:val="24"/>
+                <w:szCs w:val="24"/>
+              </w:rPr>
+              <w:t>{{ia}}</w:t>
             </w:r>
             <w:r>
               <w:rPr>
@@ -2262,7 +1579,6 @@
               <w:rPr>
                 <w:sz w:val="24"/>
                 <w:szCs w:val="24"/>
-                <w:lang w:val="en-US"/>
               </w:rPr>
             </w:pPr>
             <w:r>
@@ -2270,13 +1586,19 @@
                 <w:sz w:val="24"/>
                 <w:szCs w:val="24"/>
               </w:rPr>
-              <w:t>угол</w:t>
-            </w:r>
-            <w:r>
-              <w:rPr>
-                <w:sz w:val="24"/>
-                <w:szCs w:val="24"/>
-                <w:lang w:val="en-US"/>
+              <w:t xml:space="preserve">угол – </w:t>
+            </w:r>
+            <w:r>
+              <w:rPr>
+                <w:sz w:val="24"/>
+                <w:szCs w:val="24"/>
+              </w:rPr>
+              <w:t>{{angle_a}}</w:t>
+            </w:r>
+            <w:r>
+              <w:rPr>
+                <w:sz w:val="24"/>
+                <w:szCs w:val="24"/>
               </w:rPr>
               <w:t xml:space="preserve"> </w:t>
             </w:r>
@@ -2284,69 +1606,8 @@
               <w:rPr>
                 <w:sz w:val="24"/>
                 <w:szCs w:val="24"/>
-                <w:lang w:val="en-US"/>
-              </w:rPr>
-              <w:t xml:space="preserve">– </w:t>
-            </w:r>
-            <w:r>
-              <w:rPr>
-                <w:sz w:val="24"/>
-                <w:szCs w:val="24"/>
-                <w:lang w:val="en-US"/>
-              </w:rPr>
-              <w:t>{{</w:t>
-            </w:r>
-            <w:proofErr w:type="spellStart"/>
-            <w:r>
-              <w:rPr>
-                <w:sz w:val="24"/>
-                <w:szCs w:val="24"/>
-                <w:lang w:val="en-US"/>
-              </w:rPr>
-              <w:t>angle_a</w:t>
-            </w:r>
-            <w:proofErr w:type="spellEnd"/>
-            <w:r>
-              <w:rPr>
-                <w:sz w:val="24"/>
-                <w:szCs w:val="24"/>
-                <w:lang w:val="en-US"/>
-              </w:rPr>
-              <w:t>}}</w:t>
-            </w:r>
-            <w:r>
-              <w:rPr>
-                <w:sz w:val="24"/>
-                <w:szCs w:val="24"/>
-                <w:lang w:val="en-US"/>
-              </w:rPr>
-              <w:t xml:space="preserve"> </w:t>
-            </w:r>
-            <w:r>
-              <w:rPr>
-                <w:sz w:val="24"/>
-                <w:szCs w:val="24"/>
-                <w:lang w:val="en-US"/>
-              </w:rPr>
-              <w:t>{{</w:t>
-            </w:r>
-            <w:proofErr w:type="spellStart"/>
-            <w:r>
-              <w:rPr>
-                <w:sz w:val="24"/>
-                <w:szCs w:val="24"/>
-                <w:lang w:val="en-US"/>
-              </w:rPr>
-              <w:t>type_a</w:t>
-            </w:r>
-            <w:proofErr w:type="spellEnd"/>
-            <w:r>
-              <w:rPr>
-                <w:sz w:val="24"/>
-                <w:szCs w:val="24"/>
-                <w:lang w:val="en-US"/>
-              </w:rPr>
-              <w:t>}}</w:t>
+              </w:rPr>
+              <w:t>{{type_a}}</w:t>
             </w:r>
           </w:p>
         </w:tc>
@@ -2376,7 +1637,6 @@
               <w:rPr>
                 <w:sz w:val="24"/>
                 <w:szCs w:val="24"/>
-                <w:lang w:val="en-US"/>
               </w:rPr>
               <w:t xml:space="preserve">I= </w:t>
             </w:r>
@@ -2384,27 +1644,8 @@
               <w:rPr>
                 <w:sz w:val="24"/>
                 <w:szCs w:val="24"/>
-                <w:lang w:val="en-US"/>
-              </w:rPr>
-              <w:t>{{</w:t>
-            </w:r>
-            <w:proofErr w:type="spellStart"/>
-            <w:r>
-              <w:rPr>
-                <w:sz w:val="24"/>
-                <w:szCs w:val="24"/>
-                <w:lang w:val="en-US"/>
-              </w:rPr>
-              <w:t>ib</w:t>
-            </w:r>
-            <w:proofErr w:type="spellEnd"/>
-            <w:r>
-              <w:rPr>
-                <w:sz w:val="24"/>
-                <w:szCs w:val="24"/>
-                <w:lang w:val="en-US"/>
-              </w:rPr>
-              <w:t>}}</w:t>
+              </w:rPr>
+              <w:t>{{ib}}</w:t>
             </w:r>
             <w:r>
               <w:rPr>
@@ -2439,51 +1680,14 @@
                 <w:sz w:val="24"/>
                 <w:szCs w:val="24"/>
               </w:rPr>
-              <w:t>угол</w:t>
-            </w:r>
-            <w:r>
-              <w:rPr>
-                <w:sz w:val="24"/>
-                <w:szCs w:val="24"/>
-              </w:rPr>
-              <w:t xml:space="preserve"> – </w:t>
-            </w:r>
-            <w:r>
-              <w:rPr>
-                <w:sz w:val="24"/>
-                <w:szCs w:val="24"/>
-              </w:rPr>
-              <w:t>{{</w:t>
-            </w:r>
-            <w:r>
-              <w:rPr>
-                <w:sz w:val="24"/>
-                <w:szCs w:val="24"/>
-                <w:lang w:val="en-US"/>
-              </w:rPr>
-              <w:t>angle</w:t>
-            </w:r>
-            <w:r>
-              <w:rPr>
-                <w:sz w:val="24"/>
-                <w:szCs w:val="24"/>
-              </w:rPr>
-              <w:t>_</w:t>
-            </w:r>
-            <w:r>
-              <w:rPr>
-                <w:sz w:val="24"/>
-                <w:szCs w:val="24"/>
-                <w:lang w:val="en-US"/>
-              </w:rPr>
-              <w:t>b</w:t>
-            </w:r>
-            <w:r>
-              <w:rPr>
-                <w:sz w:val="24"/>
-                <w:szCs w:val="24"/>
-              </w:rPr>
-              <w:t>}}</w:t>
+              <w:t xml:space="preserve">угол – </w:t>
+            </w:r>
+            <w:r>
+              <w:rPr>
+                <w:sz w:val="24"/>
+                <w:szCs w:val="24"/>
+              </w:rPr>
+              <w:t>{{angle_b}}</w:t>
             </w:r>
             <w:r>
               <w:rPr>
@@ -2497,37 +1701,7 @@
                 <w:sz w:val="24"/>
                 <w:szCs w:val="24"/>
               </w:rPr>
-              <w:t>{{</w:t>
-            </w:r>
-            <w:r>
-              <w:rPr>
-                <w:sz w:val="24"/>
-                <w:szCs w:val="24"/>
-                <w:lang w:val="en-US"/>
-              </w:rPr>
-              <w:t>type</w:t>
-            </w:r>
-            <w:r>
-              <w:rPr>
-                <w:sz w:val="24"/>
-                <w:szCs w:val="24"/>
-              </w:rPr>
-              <w:t>_</w:t>
-            </w:r>
-            <w:r>
-              <w:rPr>
-                <w:sz w:val="24"/>
-                <w:szCs w:val="24"/>
-                <w:lang w:val="en-US"/>
-              </w:rPr>
-              <w:t>b</w:t>
-            </w:r>
-            <w:r>
-              <w:rPr>
-                <w:sz w:val="24"/>
-                <w:szCs w:val="24"/>
-              </w:rPr>
-              <w:t>}}</w:t>
+              <w:t>{{type_b}}</w:t>
             </w:r>
           </w:p>
         </w:tc>
@@ -2554,7 +1728,6 @@
               <w:rPr>
                 <w:sz w:val="24"/>
                 <w:szCs w:val="24"/>
-                <w:lang w:val="en-US"/>
               </w:rPr>
               <w:t xml:space="preserve">I= </w:t>
             </w:r>
@@ -2562,27 +1735,8 @@
               <w:rPr>
                 <w:sz w:val="24"/>
                 <w:szCs w:val="24"/>
-                <w:lang w:val="en-US"/>
-              </w:rPr>
-              <w:t>{{</w:t>
-            </w:r>
-            <w:proofErr w:type="spellStart"/>
-            <w:r>
-              <w:rPr>
-                <w:sz w:val="24"/>
-                <w:szCs w:val="24"/>
-                <w:lang w:val="en-US"/>
-              </w:rPr>
-              <w:t>ic</w:t>
-            </w:r>
-            <w:proofErr w:type="spellEnd"/>
-            <w:r>
-              <w:rPr>
-                <w:sz w:val="24"/>
-                <w:szCs w:val="24"/>
-                <w:lang w:val="en-US"/>
-              </w:rPr>
-              <w:t>}}</w:t>
+              </w:rPr>
+              <w:t>{{ic}}</w:t>
             </w:r>
             <w:r>
               <w:rPr>
@@ -2617,51 +1771,14 @@
                 <w:sz w:val="24"/>
                 <w:szCs w:val="24"/>
               </w:rPr>
-              <w:t>угол</w:t>
-            </w:r>
-            <w:r>
-              <w:rPr>
-                <w:sz w:val="24"/>
-                <w:szCs w:val="24"/>
-              </w:rPr>
-              <w:t xml:space="preserve"> – </w:t>
-            </w:r>
-            <w:r>
-              <w:rPr>
-                <w:sz w:val="24"/>
-                <w:szCs w:val="24"/>
-              </w:rPr>
-              <w:t>{{</w:t>
-            </w:r>
-            <w:r>
-              <w:rPr>
-                <w:sz w:val="24"/>
-                <w:szCs w:val="24"/>
-                <w:lang w:val="en-US"/>
-              </w:rPr>
-              <w:t>angle</w:t>
-            </w:r>
-            <w:r>
-              <w:rPr>
-                <w:sz w:val="24"/>
-                <w:szCs w:val="24"/>
-              </w:rPr>
-              <w:t>_</w:t>
-            </w:r>
-            <w:r>
-              <w:rPr>
-                <w:sz w:val="24"/>
-                <w:szCs w:val="24"/>
-                <w:lang w:val="en-US"/>
-              </w:rPr>
-              <w:t>c</w:t>
-            </w:r>
-            <w:r>
-              <w:rPr>
-                <w:sz w:val="24"/>
-                <w:szCs w:val="24"/>
-              </w:rPr>
-              <w:t>}}</w:t>
+              <w:t xml:space="preserve">угол – </w:t>
+            </w:r>
+            <w:r>
+              <w:rPr>
+                <w:sz w:val="24"/>
+                <w:szCs w:val="24"/>
+              </w:rPr>
+              <w:t>{{angle_c}}</w:t>
             </w:r>
             <w:r>
               <w:rPr>
@@ -2675,37 +1792,7 @@
                 <w:sz w:val="24"/>
                 <w:szCs w:val="24"/>
               </w:rPr>
-              <w:t>{{</w:t>
-            </w:r>
-            <w:r>
-              <w:rPr>
-                <w:sz w:val="24"/>
-                <w:szCs w:val="24"/>
-                <w:lang w:val="en-US"/>
-              </w:rPr>
-              <w:t>type</w:t>
-            </w:r>
-            <w:r>
-              <w:rPr>
-                <w:sz w:val="24"/>
-                <w:szCs w:val="24"/>
-              </w:rPr>
-              <w:t>_</w:t>
-            </w:r>
-            <w:r>
-              <w:rPr>
-                <w:sz w:val="24"/>
-                <w:szCs w:val="24"/>
-                <w:lang w:val="en-US"/>
-              </w:rPr>
-              <w:t>c</w:t>
-            </w:r>
-            <w:r>
-              <w:rPr>
-                <w:sz w:val="24"/>
-                <w:szCs w:val="24"/>
-              </w:rPr>
-              <w:t>}}</w:t>
+              <w:t>{{type_c}}</w:t>
             </w:r>
           </w:p>
         </w:tc>
@@ -2736,161 +1823,47 @@
         </w:rPr>
         <w:t xml:space="preserve">Напряжение: </w:t>
       </w:r>
-      <w:proofErr w:type="spellStart"/>
-      <w:r>
-        <w:rPr>
-          <w:sz w:val="24"/>
-          <w:szCs w:val="24"/>
-          <w:lang w:val="en-US"/>
-        </w:rPr>
-        <w:t>Uab</w:t>
-      </w:r>
-      <w:proofErr w:type="spellEnd"/>
-      <w:r>
-        <w:rPr>
-          <w:sz w:val="24"/>
-          <w:szCs w:val="24"/>
-        </w:rPr>
-        <w:t xml:space="preserve"> </w:t>
-      </w:r>
-      <w:r>
-        <w:rPr>
-          <w:sz w:val="24"/>
-          <w:szCs w:val="24"/>
-        </w:rPr>
-        <w:t xml:space="preserve">= </w:t>
-      </w:r>
-      <w:r>
-        <w:rPr>
-          <w:sz w:val="24"/>
-          <w:szCs w:val="24"/>
-        </w:rPr>
-        <w:t>{{</w:t>
-      </w:r>
-      <w:proofErr w:type="spellStart"/>
-      <w:r>
-        <w:rPr>
-          <w:sz w:val="24"/>
-          <w:szCs w:val="24"/>
-          <w:lang w:val="en-US"/>
-        </w:rPr>
-        <w:t>uab</w:t>
-      </w:r>
-      <w:proofErr w:type="spellEnd"/>
-      <w:r>
-        <w:rPr>
-          <w:sz w:val="24"/>
-          <w:szCs w:val="24"/>
-        </w:rPr>
-        <w:t>}}</w:t>
-      </w:r>
-      <w:r>
-        <w:rPr>
-          <w:sz w:val="24"/>
-          <w:szCs w:val="24"/>
-        </w:rPr>
-        <w:t xml:space="preserve"> В; </w:t>
-      </w:r>
-      <w:proofErr w:type="spellStart"/>
-      <w:r>
-        <w:rPr>
-          <w:sz w:val="24"/>
-          <w:szCs w:val="24"/>
-          <w:lang w:val="en-US"/>
-        </w:rPr>
-        <w:t>Ubc</w:t>
-      </w:r>
-      <w:proofErr w:type="spellEnd"/>
-      <w:r>
-        <w:rPr>
-          <w:sz w:val="24"/>
-          <w:szCs w:val="24"/>
-        </w:rPr>
-        <w:t xml:space="preserve"> </w:t>
-      </w:r>
-      <w:r>
-        <w:rPr>
-          <w:sz w:val="24"/>
-          <w:szCs w:val="24"/>
-        </w:rPr>
-        <w:t xml:space="preserve">= </w:t>
-      </w:r>
-      <w:r>
-        <w:rPr>
-          <w:sz w:val="24"/>
-          <w:szCs w:val="24"/>
-        </w:rPr>
-        <w:t>{{</w:t>
-      </w:r>
-      <w:proofErr w:type="spellStart"/>
-      <w:r>
-        <w:rPr>
-          <w:sz w:val="24"/>
-          <w:szCs w:val="24"/>
-          <w:lang w:val="en-US"/>
-        </w:rPr>
-        <w:t>ubc</w:t>
-      </w:r>
-      <w:proofErr w:type="spellEnd"/>
-      <w:r>
-        <w:rPr>
-          <w:sz w:val="24"/>
-          <w:szCs w:val="24"/>
-        </w:rPr>
-        <w:t>}}</w:t>
-      </w:r>
-      <w:r>
-        <w:rPr>
-          <w:sz w:val="24"/>
-          <w:szCs w:val="24"/>
-        </w:rPr>
-        <w:t xml:space="preserve"> В; </w:t>
-      </w:r>
-      <w:r>
-        <w:rPr>
-          <w:sz w:val="24"/>
-          <w:szCs w:val="24"/>
-          <w:lang w:val="en-US"/>
-        </w:rPr>
-        <w:t>Uca</w:t>
-      </w:r>
-      <w:r>
-        <w:rPr>
-          <w:sz w:val="24"/>
-          <w:szCs w:val="24"/>
-        </w:rPr>
-        <w:t xml:space="preserve"> </w:t>
-      </w:r>
-      <w:r>
-        <w:rPr>
-          <w:sz w:val="24"/>
-          <w:szCs w:val="24"/>
-        </w:rPr>
-        <w:t xml:space="preserve">= </w:t>
-      </w:r>
-      <w:r>
-        <w:rPr>
-          <w:sz w:val="24"/>
-          <w:szCs w:val="24"/>
-        </w:rPr>
-        <w:t>{{</w:t>
-      </w:r>
-      <w:proofErr w:type="spellStart"/>
-      <w:r>
-        <w:rPr>
-          <w:sz w:val="24"/>
-          <w:szCs w:val="24"/>
-          <w:lang w:val="en-US"/>
-        </w:rPr>
-        <w:t>uca</w:t>
-      </w:r>
-      <w:proofErr w:type="spellEnd"/>
-      <w:r>
-        <w:rPr>
-          <w:sz w:val="24"/>
-          <w:szCs w:val="24"/>
-        </w:rPr>
-        <w:t>}}</w:t>
+      <w:r>
+        <w:rPr>
+          <w:sz w:val="24"/>
+          <w:szCs w:val="24"/>
+        </w:rPr>
+        <w:t xml:space="preserve">Uab = </w:t>
+      </w:r>
+      <w:r>
+        <w:rPr>
+          <w:sz w:val="24"/>
+          <w:szCs w:val="24"/>
+        </w:rPr>
+        <w:t>{{uab}}</w:t>
+      </w:r>
+      <w:r>
+        <w:rPr>
+          <w:sz w:val="24"/>
+          <w:szCs w:val="24"/>
+        </w:rPr>
+        <w:t xml:space="preserve"> В; Ubc = </w:t>
+      </w:r>
+      <w:r>
+        <w:rPr>
+          <w:sz w:val="24"/>
+          <w:szCs w:val="24"/>
+        </w:rPr>
+        <w:t>{{ubc}}</w:t>
+      </w:r>
+      <w:r>
+        <w:rPr>
+          <w:sz w:val="24"/>
+          <w:szCs w:val="24"/>
+        </w:rPr>
+        <w:t xml:space="preserve"> В; Uca = </w:t>
+      </w:r>
+      <w:r>
+        <w:rPr>
+          <w:sz w:val="24"/>
+          <w:szCs w:val="24"/>
+        </w:rPr>
+        <w:t>{{uca}}</w:t>
       </w:r>
       <w:r>
         <w:rPr>
@@ -2903,7 +1876,24 @@
     <w:p>
       <w:pPr>
         <w:rPr>
-          <w:b/>
+          <w:bCs/>
+          <w:sz w:val="24"/>
+          <w:szCs w:val="24"/>
+        </w:rPr>
+      </w:pPr>
+      <w:r>
+        <w:rPr>
+          <w:bCs/>
+          <w:sz w:val="24"/>
+          <w:szCs w:val="24"/>
+        </w:rPr>
+        <w:t>{{/vector_diagram}}</w:t>
+      </w:r>
+    </w:p>
+    <w:p>
+      <w:pPr>
+        <w:rPr>
+          <w:bCs/>
           <w:sz w:val="24"/>
           <w:szCs w:val="24"/>
         </w:rPr>
@@ -2937,44 +1927,7 @@
           <w:sz w:val="24"/>
           <w:szCs w:val="24"/>
         </w:rPr>
-        <w:t>{{</w:t>
-      </w:r>
-      <w:r>
-        <w:rPr>
-          <w:sz w:val="24"/>
-          <w:szCs w:val="24"/>
-          <w:lang w:val="en-US"/>
-        </w:rPr>
-        <w:t>reason</w:t>
-      </w:r>
-      <w:r>
-        <w:rPr>
-          <w:sz w:val="24"/>
-          <w:szCs w:val="24"/>
-        </w:rPr>
-        <w:t xml:space="preserve">}} </w:t>
-      </w:r>
-      <w:r>
-        <w:rPr>
-          <w:sz w:val="24"/>
-          <w:szCs w:val="24"/>
-        </w:rPr>
-        <w:t>{{</w:t>
-      </w:r>
-      <w:r>
-        <w:rPr>
-          <w:sz w:val="24"/>
-          <w:szCs w:val="24"/>
-          <w:lang w:val="en-US"/>
-        </w:rPr>
-        <w:t>result</w:t>
-      </w:r>
-      <w:r>
-        <w:rPr>
-          <w:sz w:val="24"/>
-          <w:szCs w:val="24"/>
-        </w:rPr>
-        <w:t>}}</w:t>
+        <w:t>{{reason}} {{result}}</w:t>
       </w:r>
       <w:r>
         <w:rPr>
@@ -3053,15 +2006,14 @@
           <w:sz w:val="24"/>
           <w:szCs w:val="24"/>
         </w:rPr>
-        <w:t>{{</w:t>
-      </w:r>
-      <w:r>
-        <w:rPr>
-          <w:sz w:val="24"/>
-          <w:szCs w:val="24"/>
-          <w:lang w:val="en-US"/>
-        </w:rPr>
-        <w:t>seal</w:t>
+        <w:t>{{seal</w:t>
+      </w:r>
+      <w:r>
+        <w:rPr>
+          <w:sz w:val="24"/>
+          <w:szCs w:val="24"/>
+        </w:rPr>
+        <w:t>_number</w:t>
       </w:r>
       <w:r>
         <w:rPr>
@@ -3090,6 +2042,9 @@
     </w:p>
     <w:p>
       <w:pPr>
+        <w:tabs>
+          <w:tab w:val="left" w:pos="8505"/>
+        </w:tabs>
         <w:spacing w:line="360" w:lineRule="auto"/>
         <w:rPr>
           <w:rFonts w:ascii="Times New Roman CYR" w:hAnsi="Times New Roman CYR"/>
@@ -3103,7 +2058,7 @@
           <w:sz w:val="24"/>
           <w:szCs w:val="24"/>
         </w:rPr>
-        <w:t>Представитель ТОО «Межрегионэнерготранзит»</w:t>
+        <w:t>{{employee_signature_title}}</w:t>
       </w:r>
       <w:r>
         <w:rPr>
@@ -3111,6 +2066,14 @@
           <w:sz w:val="24"/>
           <w:szCs w:val="24"/>
         </w:rPr>
+        <w:t xml:space="preserve"> </w:t>
+      </w:r>
+      <w:r>
+        <w:rPr>
+          <w:rFonts w:ascii="Times New Roman CYR" w:hAnsi="Times New Roman CYR"/>
+          <w:sz w:val="24"/>
+          <w:szCs w:val="24"/>
+        </w:rPr>
         <w:tab/>
       </w:r>
       <w:r>
@@ -3119,83 +2082,19 @@
           <w:sz w:val="24"/>
           <w:szCs w:val="24"/>
         </w:rPr>
-        <w:tab/>
-      </w:r>
-      <w:r>
-        <w:rPr>
-          <w:rFonts w:ascii="Times New Roman CYR" w:hAnsi="Times New Roman CYR"/>
-          <w:sz w:val="24"/>
-          <w:szCs w:val="24"/>
-        </w:rPr>
-        <w:tab/>
-      </w:r>
-      <w:r>
-        <w:rPr>
-          <w:rFonts w:ascii="Times New Roman CYR" w:hAnsi="Times New Roman CYR"/>
-          <w:sz w:val="24"/>
-          <w:szCs w:val="24"/>
-        </w:rPr>
-        <w:tab/>
-      </w:r>
-      <w:r>
-        <w:rPr>
-          <w:rFonts w:ascii="Times New Roman CYR" w:hAnsi="Times New Roman CYR"/>
-          <w:sz w:val="24"/>
-          <w:szCs w:val="24"/>
-        </w:rPr>
-        <w:tab/>
-      </w:r>
-      <w:r>
-        <w:rPr>
-          <w:rFonts w:ascii="Times New Roman CYR" w:hAnsi="Times New Roman CYR"/>
-          <w:sz w:val="24"/>
-          <w:szCs w:val="24"/>
-        </w:rPr>
-        <w:t>{{</w:t>
-      </w:r>
-      <w:r>
-        <w:rPr>
-          <w:rFonts w:ascii="Times New Roman CYR" w:hAnsi="Times New Roman CYR"/>
-          <w:sz w:val="24"/>
-          <w:szCs w:val="24"/>
-          <w:lang w:val="en-US"/>
-        </w:rPr>
-        <w:t>employee</w:t>
-      </w:r>
-      <w:r>
-        <w:rPr>
-          <w:rFonts w:ascii="Times New Roman CYR" w:hAnsi="Times New Roman CYR"/>
-          <w:sz w:val="24"/>
-          <w:szCs w:val="24"/>
-        </w:rPr>
-        <w:t>_</w:t>
-      </w:r>
-      <w:r>
-        <w:rPr>
-          <w:rFonts w:ascii="Times New Roman CYR" w:hAnsi="Times New Roman CYR"/>
-          <w:sz w:val="24"/>
-          <w:szCs w:val="24"/>
-          <w:lang w:val="en-US"/>
-        </w:rPr>
-        <w:t>name</w:t>
-      </w:r>
-      <w:r>
-        <w:rPr>
-          <w:rFonts w:ascii="Times New Roman CYR" w:hAnsi="Times New Roman CYR"/>
-          <w:sz w:val="24"/>
-          <w:szCs w:val="24"/>
-        </w:rPr>
-        <w:t>}}</w:t>
+        <w:t>{{employee_name}}</w:t>
       </w:r>
     </w:p>
     <w:p>
       <w:pPr>
+        <w:tabs>
+          <w:tab w:val="left" w:pos="8505"/>
+        </w:tabs>
         <w:spacing w:line="360" w:lineRule="auto"/>
         <w:rPr>
           <w:rFonts w:ascii="Times New Roman CYR" w:hAnsi="Times New Roman CYR"/>
           <w:sz w:val="24"/>
           <w:szCs w:val="24"/>
-          <w:lang w:val="en-US"/>
         </w:rPr>
       </w:pPr>
       <w:r>
@@ -3203,225 +2102,43 @@
           <w:rFonts w:ascii="Times New Roman CYR" w:hAnsi="Times New Roman CYR"/>
           <w:sz w:val="24"/>
           <w:szCs w:val="24"/>
-          <w:lang w:val="en-US"/>
         </w:rPr>
         <w:t>{{#representative_signature}}</w:t>
       </w:r>
+      <w:r>
+        <w:rPr>
+          <w:rFonts w:ascii="Times New Roman CYR" w:hAnsi="Times New Roman CYR"/>
+          <w:sz w:val="24"/>
+          <w:szCs w:val="24"/>
+        </w:rPr>
+        <w:t>Представитель {{representative_organization}}</w:t>
+      </w:r>
+      <w:r>
+        <w:rPr>
+          <w:rFonts w:ascii="Times New Roman CYR" w:hAnsi="Times New Roman CYR"/>
+          <w:sz w:val="24"/>
+          <w:szCs w:val="24"/>
+        </w:rPr>
+        <w:tab/>
+      </w:r>
+      <w:r>
+        <w:rPr>
+          <w:rFonts w:ascii="Times New Roman CYR" w:hAnsi="Times New Roman CYR"/>
+          <w:sz w:val="24"/>
+          <w:szCs w:val="24"/>
+        </w:rPr>
+        <w:t>{{representative_name}}</w:t>
+      </w:r>
+      <w:r>
+        <w:rPr>
+          <w:rFonts w:ascii="Times New Roman CYR" w:hAnsi="Times New Roman CYR"/>
+          <w:sz w:val="24"/>
+          <w:szCs w:val="24"/>
+        </w:rPr>
+        <w:t>{{/representative_signature}}</w:t>
+      </w:r>
     </w:p>
-    <w:p>
-      <w:pPr>
-        <w:spacing w:line="360" w:lineRule="auto"/>
-        <w:rPr>
-          <w:rFonts w:ascii="Times New Roman CYR" w:hAnsi="Times New Roman CYR"/>
-          <w:sz w:val="24"/>
-          <w:szCs w:val="24"/>
-          <w:lang w:val="en-US"/>
-        </w:rPr>
-      </w:pPr>
-      <w:r>
-        <w:rPr>
-          <w:rFonts w:ascii="Times New Roman CYR" w:hAnsi="Times New Roman CYR"/>
-          <w:sz w:val="24"/>
-          <w:szCs w:val="24"/>
-        </w:rPr>
-        <w:t>Представитель</w:t>
-      </w:r>
-      <w:r>
-        <w:rPr>
-          <w:rFonts w:ascii="Times New Roman CYR" w:hAnsi="Times New Roman CYR"/>
-          <w:sz w:val="24"/>
-          <w:szCs w:val="24"/>
-          <w:lang w:val="en-US"/>
-        </w:rPr>
-        <w:t xml:space="preserve"> </w:t>
-      </w:r>
-      <w:r>
-        <w:rPr>
-          <w:rFonts w:ascii="Times New Roman CYR" w:hAnsi="Times New Roman CYR"/>
-          <w:sz w:val="24"/>
-          <w:szCs w:val="24"/>
-          <w:lang w:val="en-US"/>
-        </w:rPr>
-        <w:t>{{</w:t>
-      </w:r>
-      <w:proofErr w:type="spellStart"/>
-      <w:r>
-        <w:rPr>
-          <w:rFonts w:ascii="Times New Roman CYR" w:hAnsi="Times New Roman CYR"/>
-          <w:sz w:val="24"/>
-          <w:szCs w:val="24"/>
-          <w:lang w:val="en-US"/>
-        </w:rPr>
-        <w:t>representative_organization</w:t>
-      </w:r>
-      <w:proofErr w:type="spellEnd"/>
-      <w:r>
-        <w:rPr>
-          <w:rFonts w:ascii="Times New Roman CYR" w:hAnsi="Times New Roman CYR"/>
-          <w:sz w:val="24"/>
-          <w:szCs w:val="24"/>
-          <w:lang w:val="en-US"/>
-        </w:rPr>
-        <w:t>}}</w:t>
-      </w:r>
-      <w:r>
-        <w:rPr>
-          <w:rFonts w:ascii="Times New Roman CYR" w:hAnsi="Times New Roman CYR"/>
-          <w:sz w:val="24"/>
-          <w:szCs w:val="24"/>
-          <w:lang w:val="en-US"/>
-        </w:rPr>
-        <w:tab/>
-      </w:r>
-      <w:r>
-        <w:rPr>
-          <w:rFonts w:ascii="Times New Roman CYR" w:hAnsi="Times New Roman CYR"/>
-          <w:sz w:val="24"/>
-          <w:szCs w:val="24"/>
-          <w:lang w:val="en-US"/>
-        </w:rPr>
-        <w:tab/>
-      </w:r>
-      <w:r>
-        <w:rPr>
-          <w:rFonts w:ascii="Times New Roman CYR" w:hAnsi="Times New Roman CYR"/>
-          <w:sz w:val="24"/>
-          <w:szCs w:val="24"/>
-          <w:lang w:val="en-US"/>
-        </w:rPr>
-        <w:tab/>
-      </w:r>
-      <w:r>
-        <w:rPr>
-          <w:rFonts w:ascii="Times New Roman CYR" w:hAnsi="Times New Roman CYR"/>
-          <w:sz w:val="24"/>
-          <w:szCs w:val="24"/>
-          <w:lang w:val="en-US"/>
-        </w:rPr>
-        <w:tab/>
-      </w:r>
-      <w:r>
-        <w:rPr>
-          <w:rFonts w:ascii="Times New Roman CYR" w:hAnsi="Times New Roman CYR"/>
-          <w:sz w:val="24"/>
-          <w:szCs w:val="24"/>
-          <w:lang w:val="en-US"/>
-        </w:rPr>
-        <w:tab/>
-      </w:r>
-      <w:r>
-        <w:rPr>
-          <w:rFonts w:ascii="Times New Roman CYR" w:hAnsi="Times New Roman CYR"/>
-          <w:sz w:val="24"/>
-          <w:szCs w:val="24"/>
-          <w:lang w:val="en-US"/>
-        </w:rPr>
-        <w:tab/>
-      </w:r>
-      <w:r>
-        <w:rPr>
-          <w:rFonts w:ascii="Times New Roman CYR" w:hAnsi="Times New Roman CYR"/>
-          <w:sz w:val="24"/>
-          <w:szCs w:val="24"/>
-          <w:lang w:val="en-US"/>
-        </w:rPr>
-        <w:tab/>
-      </w:r>
-      <w:r>
-        <w:rPr>
-          <w:rFonts w:ascii="Times New Roman CYR" w:hAnsi="Times New Roman CYR"/>
-          <w:sz w:val="24"/>
-          <w:szCs w:val="24"/>
-          <w:lang w:val="en-US"/>
-        </w:rPr>
-        <w:t>{{</w:t>
-      </w:r>
-      <w:proofErr w:type="spellStart"/>
-      <w:r>
-        <w:rPr>
-          <w:rFonts w:ascii="Times New Roman CYR" w:hAnsi="Times New Roman CYR"/>
-          <w:sz w:val="24"/>
-          <w:szCs w:val="24"/>
-          <w:lang w:val="en-US"/>
-        </w:rPr>
-        <w:t>representative</w:t>
-      </w:r>
-      <w:r>
-        <w:rPr>
-          <w:rFonts w:ascii="Times New Roman CYR" w:hAnsi="Times New Roman CYR"/>
-          <w:sz w:val="24"/>
-          <w:szCs w:val="24"/>
-          <w:lang w:val="en-US"/>
-        </w:rPr>
-        <w:t>_</w:t>
-      </w:r>
-      <w:r>
-        <w:rPr>
-          <w:rFonts w:ascii="Times New Roman CYR" w:hAnsi="Times New Roman CYR"/>
-          <w:sz w:val="24"/>
-          <w:szCs w:val="24"/>
-          <w:lang w:val="en-US"/>
-        </w:rPr>
-        <w:t>name</w:t>
-      </w:r>
-      <w:proofErr w:type="spellEnd"/>
-      <w:r>
-        <w:rPr>
-          <w:rFonts w:ascii="Times New Roman CYR" w:hAnsi="Times New Roman CYR"/>
-          <w:sz w:val="24"/>
-          <w:szCs w:val="24"/>
-          <w:lang w:val="en-US"/>
-        </w:rPr>
-        <w:t>}}</w:t>
-      </w:r>
-    </w:p>
-    <w:p>
-      <w:pPr>
-        <w:spacing w:line="360" w:lineRule="auto"/>
-        <w:rPr>
-          <w:rFonts w:ascii="Times New Roman CYR" w:hAnsi="Times New Roman CYR"/>
-          <w:sz w:val="24"/>
-          <w:szCs w:val="24"/>
-          <w:lang w:val="en-US"/>
-        </w:rPr>
-      </w:pPr>
-      <w:r>
-        <w:rPr>
-          <w:rFonts w:ascii="Times New Roman CYR" w:hAnsi="Times New Roman CYR"/>
-          <w:sz w:val="24"/>
-          <w:szCs w:val="24"/>
-          <w:lang w:val="en-US"/>
-        </w:rPr>
-        <w:t>{{/</w:t>
-      </w:r>
-      <w:proofErr w:type="spellStart"/>
-      <w:r>
-        <w:rPr>
-          <w:rFonts w:ascii="Times New Roman CYR" w:hAnsi="Times New Roman CYR"/>
-          <w:sz w:val="24"/>
-          <w:szCs w:val="24"/>
-          <w:lang w:val="en-US"/>
-        </w:rPr>
-        <w:t>representative_signature</w:t>
-      </w:r>
-      <w:proofErr w:type="spellEnd"/>
-      <w:r>
-        <w:rPr>
-          <w:rFonts w:ascii="Times New Roman CYR" w:hAnsi="Times New Roman CYR"/>
-          <w:sz w:val="24"/>
-          <w:szCs w:val="24"/>
-          <w:lang w:val="en-US"/>
-        </w:rPr>
-        <w:t>}}</w:t>
-      </w:r>
-    </w:p>
-    <w:p>
-      <w:pPr>
-        <w:rPr>
-          <w:lang w:val="en-US"/>
-        </w:rPr>
-      </w:pPr>
-    </w:p>
+    <w:p/>
     <w:sectPr>
       <w:pgSz w:w="11906" w:h="16838"/>
       <w:pgMar w:top="0" w:right="424" w:bottom="0" w:left="720" w:header="708" w:footer="708" w:gutter="0"/>

</xml_diff>

<commit_message>
Some fixes in archive view widget
</commit_message>
<xml_diff>
--- a/templates/act_check.docx
+++ b/templates/act_check.docx
@@ -147,6 +147,7 @@
                       <w:szCs w:val="18"/>
                     </w:rPr>
                   </w:pPr>
+                  <w:proofErr w:type="gramStart"/>
                   <w:r>
                     <w:rPr>
                       <w:b/>
@@ -154,7 +155,17 @@
                       <w:sz w:val="18"/>
                       <w:szCs w:val="18"/>
                     </w:rPr>
-                    <w:t>110010  г. Костанай,</w:t>
+                    <w:t>110010  г.</w:t>
+                  </w:r>
+                  <w:proofErr w:type="gramEnd"/>
+                  <w:r>
+                    <w:rPr>
+                      <w:b/>
+                      <w:bCs/>
+                      <w:sz w:val="18"/>
+                      <w:szCs w:val="18"/>
+                    </w:rPr>
+                    <w:t xml:space="preserve"> Костанай,</w:t>
                   </w:r>
                 </w:p>
                 <w:p>
@@ -514,26 +525,77 @@
         <w:rPr>
           <w:sz w:val="24"/>
           <w:szCs w:val="24"/>
+          <w:lang w:val="en-US"/>
         </w:rPr>
       </w:pPr>
       <w:r>
         <w:rPr>
           <w:sz w:val="24"/>
           <w:szCs w:val="24"/>
-        </w:rPr>
-        <w:t>{{#with_representatives}}</w:t>
-      </w:r>
-      <w:r>
-        <w:rPr>
-          <w:sz w:val="24"/>
-          <w:szCs w:val="24"/>
-        </w:rPr>
-        <w:t>В присутствии представителей:</w:t>
-      </w:r>
-      <w:r>
-        <w:rPr>
-          <w:sz w:val="24"/>
-          <w:szCs w:val="24"/>
+          <w:lang w:val="en-US"/>
+        </w:rPr>
+        <w:t>{{#with_representatives</w:t>
+      </w:r>
+      <w:proofErr w:type="gramStart"/>
+      <w:r>
+        <w:rPr>
+          <w:sz w:val="24"/>
+          <w:szCs w:val="24"/>
+          <w:lang w:val="en-US"/>
+        </w:rPr>
+        <w:t>}}</w:t>
+      </w:r>
+      <w:r>
+        <w:rPr>
+          <w:sz w:val="24"/>
+          <w:szCs w:val="24"/>
+        </w:rPr>
+        <w:t>В</w:t>
+      </w:r>
+      <w:proofErr w:type="gramEnd"/>
+      <w:r>
+        <w:rPr>
+          <w:sz w:val="24"/>
+          <w:szCs w:val="24"/>
+          <w:lang w:val="en-US"/>
+        </w:rPr>
+        <w:t xml:space="preserve"> </w:t>
+      </w:r>
+      <w:r>
+        <w:rPr>
+          <w:sz w:val="24"/>
+          <w:szCs w:val="24"/>
+        </w:rPr>
+        <w:t>присутствии</w:t>
+      </w:r>
+      <w:r>
+        <w:rPr>
+          <w:sz w:val="24"/>
+          <w:szCs w:val="24"/>
+          <w:lang w:val="en-US"/>
+        </w:rPr>
+        <w:t xml:space="preserve"> </w:t>
+      </w:r>
+      <w:r>
+        <w:rPr>
+          <w:sz w:val="24"/>
+          <w:szCs w:val="24"/>
+        </w:rPr>
+        <w:t>представителей</w:t>
+      </w:r>
+      <w:r>
+        <w:rPr>
+          <w:sz w:val="24"/>
+          <w:szCs w:val="24"/>
+          <w:lang w:val="en-US"/>
+        </w:rPr>
+        <w:t>:</w:t>
+      </w:r>
+      <w:r>
+        <w:rPr>
+          <w:sz w:val="24"/>
+          <w:szCs w:val="24"/>
+          <w:lang w:val="en-US"/>
         </w:rPr>
         <w:t xml:space="preserve"> {{/with_representatives}}</w:t>
       </w:r>
@@ -544,28 +606,68 @@
         <w:rPr>
           <w:sz w:val="24"/>
           <w:szCs w:val="24"/>
+          <w:lang w:val="en-US"/>
         </w:rPr>
       </w:pPr>
       <w:r>
         <w:rPr>
           <w:sz w:val="24"/>
           <w:szCs w:val="24"/>
-        </w:rPr>
-        <w:t>{{#representatives_top}}</w:t>
-      </w:r>
-      <w:r>
-        <w:rPr>
-          <w:sz w:val="24"/>
-          <w:szCs w:val="24"/>
-        </w:rPr>
-        <w:t>{{representative_organization}} {{representative_position}} {{representative_name}}</w:t>
-      </w:r>
-      <w:r>
-        <w:rPr>
-          <w:sz w:val="24"/>
-          <w:szCs w:val="24"/>
-        </w:rPr>
-        <w:t>{{/representatives_top}}</w:t>
+          <w:lang w:val="en-US"/>
+        </w:rPr>
+        <w:t>{{#representatives_top</w:t>
+      </w:r>
+      <w:proofErr w:type="gramStart"/>
+      <w:r>
+        <w:rPr>
+          <w:sz w:val="24"/>
+          <w:szCs w:val="24"/>
+          <w:lang w:val="en-US"/>
+        </w:rPr>
+        <w:t>}}</w:t>
+      </w:r>
+      <w:r>
+        <w:rPr>
+          <w:sz w:val="24"/>
+          <w:szCs w:val="24"/>
+          <w:lang w:val="en-US"/>
+        </w:rPr>
+        <w:t>{</w:t>
+      </w:r>
+      <w:proofErr w:type="gramEnd"/>
+      <w:r>
+        <w:rPr>
+          <w:sz w:val="24"/>
+          <w:szCs w:val="24"/>
+          <w:lang w:val="en-US"/>
+        </w:rPr>
+        <w:t>{representative_organization}} {{representative_position}} {{representative_name</w:t>
+      </w:r>
+      <w:proofErr w:type="gramStart"/>
+      <w:r>
+        <w:rPr>
+          <w:sz w:val="24"/>
+          <w:szCs w:val="24"/>
+          <w:lang w:val="en-US"/>
+        </w:rPr>
+        <w:t>}}</w:t>
+      </w:r>
+      <w:r>
+        <w:rPr>
+          <w:sz w:val="24"/>
+          <w:szCs w:val="24"/>
+          <w:lang w:val="en-US"/>
+        </w:rPr>
+        <w:t>{</w:t>
+      </w:r>
+      <w:proofErr w:type="gramEnd"/>
+      <w:r>
+        <w:rPr>
+          <w:sz w:val="24"/>
+          <w:szCs w:val="24"/>
+          <w:lang w:val="en-US"/>
+        </w:rPr>
+        <w:t>{/representatives_top}}</w:t>
       </w:r>
     </w:p>
     <w:p>
@@ -595,6 +697,13 @@
           <w:sz w:val="24"/>
           <w:szCs w:val="24"/>
         </w:rPr>
+        <w:t xml:space="preserve"> работа по</w:t>
+      </w:r>
+      <w:r>
+        <w:rPr>
+          <w:sz w:val="24"/>
+          <w:szCs w:val="24"/>
+        </w:rPr>
         <w:t xml:space="preserve"> </w:t>
       </w:r>
       <w:r>
@@ -602,7 +711,21 @@
           <w:sz w:val="24"/>
           <w:szCs w:val="24"/>
         </w:rPr>
-        <w:t>проверка прибора учета</w:t>
+        <w:t>проверк</w:t>
+      </w:r>
+      <w:r>
+        <w:rPr>
+          <w:sz w:val="24"/>
+          <w:szCs w:val="24"/>
+        </w:rPr>
+        <w:t>е</w:t>
+      </w:r>
+      <w:r>
+        <w:rPr>
+          <w:sz w:val="24"/>
+          <w:szCs w:val="24"/>
+        </w:rPr>
+        <w:t xml:space="preserve"> прибора учета</w:t>
       </w:r>
       <w:r>
         <w:rPr>
@@ -616,14 +739,30 @@
           <w:sz w:val="24"/>
           <w:szCs w:val="24"/>
         </w:rPr>
-        <w:t>{{voltage}}</w:t>
-      </w:r>
-      <w:r>
-        <w:rPr>
-          <w:sz w:val="24"/>
-          <w:szCs w:val="24"/>
-        </w:rPr>
-        <w:t>кВ.</w:t>
+        <w:t>{{voltage</w:t>
+      </w:r>
+      <w:proofErr w:type="gramStart"/>
+      <w:r>
+        <w:rPr>
+          <w:sz w:val="24"/>
+          <w:szCs w:val="24"/>
+        </w:rPr>
+        <w:t>}}</w:t>
+      </w:r>
+      <w:r>
+        <w:rPr>
+          <w:sz w:val="24"/>
+          <w:szCs w:val="24"/>
+        </w:rPr>
+        <w:t>кВ</w:t>
+      </w:r>
+      <w:proofErr w:type="gramEnd"/>
+      <w:r>
+        <w:rPr>
+          <w:sz w:val="24"/>
+          <w:szCs w:val="24"/>
+        </w:rPr>
+        <w:t>.</w:t>
       </w:r>
     </w:p>
     <w:p>
@@ -660,6 +799,7 @@
           <w:bCs/>
           <w:sz w:val="24"/>
           <w:szCs w:val="24"/>
+          <w:lang w:val="en-US"/>
         </w:rPr>
       </w:pPr>
       <w:r>
@@ -667,6 +807,7 @@
           <w:b/>
           <w:sz w:val="24"/>
           <w:szCs w:val="24"/>
+          <w:lang w:val="en-US"/>
         </w:rPr>
         <w:t>{{connection_name}}</w:t>
       </w:r>
@@ -676,9 +817,9 @@
           <w:bCs/>
           <w:sz w:val="24"/>
           <w:szCs w:val="24"/>
+          <w:lang w:val="en-US"/>
         </w:rPr>
         <w:tab/>
-        <w:t>Ктт=</w:t>
       </w:r>
       <w:r>
         <w:rPr>
@@ -686,6 +827,26 @@
           <w:bCs/>
           <w:sz w:val="24"/>
           <w:szCs w:val="24"/>
+        </w:rPr>
+        <w:t>Ктт</w:t>
+      </w:r>
+      <w:r>
+        <w:rPr>
+          <w:b/>
+          <w:bCs/>
+          <w:sz w:val="24"/>
+          <w:szCs w:val="24"/>
+          <w:lang w:val="en-US"/>
+        </w:rPr>
+        <w:t>=</w:t>
+      </w:r>
+      <w:r>
+        <w:rPr>
+          <w:b/>
+          <w:bCs/>
+          <w:sz w:val="24"/>
+          <w:szCs w:val="24"/>
+          <w:lang w:val="en-US"/>
         </w:rPr>
         <w:t>{{ct_ratio}}</w:t>
       </w:r>
@@ -1446,12 +1607,21 @@
                 <w:szCs w:val="24"/>
               </w:rPr>
             </w:pPr>
-            <w:r>
-              <w:rPr>
-                <w:sz w:val="24"/>
-                <w:szCs w:val="24"/>
-              </w:rPr>
-              <w:t>ф.Iа</w:t>
+            <w:proofErr w:type="gramStart"/>
+            <w:r>
+              <w:rPr>
+                <w:sz w:val="24"/>
+                <w:szCs w:val="24"/>
+              </w:rPr>
+              <w:t>ф.I</w:t>
+            </w:r>
+            <w:proofErr w:type="gramEnd"/>
+            <w:r>
+              <w:rPr>
+                <w:sz w:val="24"/>
+                <w:szCs w:val="24"/>
+              </w:rPr>
+              <w:t>а</w:t>
             </w:r>
           </w:p>
         </w:tc>
@@ -1476,12 +1646,21 @@
                 <w:szCs w:val="24"/>
               </w:rPr>
             </w:pPr>
-            <w:r>
-              <w:rPr>
-                <w:sz w:val="24"/>
-                <w:szCs w:val="24"/>
-              </w:rPr>
-              <w:t>ф.Iв</w:t>
+            <w:proofErr w:type="gramStart"/>
+            <w:r>
+              <w:rPr>
+                <w:sz w:val="24"/>
+                <w:szCs w:val="24"/>
+              </w:rPr>
+              <w:t>ф.I</w:t>
+            </w:r>
+            <w:proofErr w:type="gramEnd"/>
+            <w:r>
+              <w:rPr>
+                <w:sz w:val="24"/>
+                <w:szCs w:val="24"/>
+              </w:rPr>
+              <w:t>в</w:t>
             </w:r>
           </w:p>
         </w:tc>
@@ -1506,12 +1685,21 @@
                 <w:szCs w:val="24"/>
               </w:rPr>
             </w:pPr>
-            <w:r>
-              <w:rPr>
-                <w:sz w:val="24"/>
-                <w:szCs w:val="24"/>
-              </w:rPr>
-              <w:t>ф.Iс</w:t>
+            <w:proofErr w:type="gramStart"/>
+            <w:r>
+              <w:rPr>
+                <w:sz w:val="24"/>
+                <w:szCs w:val="24"/>
+              </w:rPr>
+              <w:t>ф.I</w:t>
+            </w:r>
+            <w:proofErr w:type="gramEnd"/>
+            <w:r>
+              <w:rPr>
+                <w:sz w:val="24"/>
+                <w:szCs w:val="24"/>
+              </w:rPr>
+              <w:t>с</w:t>
             </w:r>
           </w:p>
         </w:tc>
@@ -2050,6 +2238,7 @@
           <w:rFonts w:ascii="Times New Roman CYR" w:hAnsi="Times New Roman CYR"/>
           <w:sz w:val="24"/>
           <w:szCs w:val="24"/>
+          <w:lang w:val="en-US"/>
         </w:rPr>
       </w:pPr>
       <w:r>
@@ -2057,6 +2246,7 @@
           <w:rFonts w:ascii="Times New Roman CYR" w:hAnsi="Times New Roman CYR"/>
           <w:sz w:val="24"/>
           <w:szCs w:val="24"/>
+          <w:lang w:val="en-US"/>
         </w:rPr>
         <w:t>{{employee_signature_title}}</w:t>
       </w:r>
@@ -2065,6 +2255,7 @@
           <w:rFonts w:ascii="Times New Roman CYR" w:hAnsi="Times New Roman CYR"/>
           <w:sz w:val="24"/>
           <w:szCs w:val="24"/>
+          <w:lang w:val="en-US"/>
         </w:rPr>
         <w:t xml:space="preserve"> </w:t>
       </w:r>
@@ -2073,6 +2264,7 @@
           <w:rFonts w:ascii="Times New Roman CYR" w:hAnsi="Times New Roman CYR"/>
           <w:sz w:val="24"/>
           <w:szCs w:val="24"/>
+          <w:lang w:val="en-US"/>
         </w:rPr>
         <w:tab/>
       </w:r>
@@ -2081,6 +2273,7 @@
           <w:rFonts w:ascii="Times New Roman CYR" w:hAnsi="Times New Roman CYR"/>
           <w:sz w:val="24"/>
           <w:szCs w:val="24"/>
+          <w:lang w:val="en-US"/>
         </w:rPr>
         <w:t>{{employee_name}}</w:t>
       </w:r>
@@ -2095,6 +2288,7 @@
           <w:rFonts w:ascii="Times New Roman CYR" w:hAnsi="Times New Roman CYR"/>
           <w:sz w:val="24"/>
           <w:szCs w:val="24"/>
+          <w:lang w:val="en-US"/>
         </w:rPr>
       </w:pPr>
       <w:r>
@@ -2102,16 +2296,19 @@
           <w:rFonts w:ascii="Times New Roman CYR" w:hAnsi="Times New Roman CYR"/>
           <w:sz w:val="24"/>
           <w:szCs w:val="24"/>
-        </w:rPr>
-        <w:t>{{#representative_signature}}</w:t>
-      </w:r>
+          <w:lang w:val="en-US"/>
+        </w:rPr>
+        <w:t>{{#representative_signature</w:t>
+      </w:r>
+      <w:proofErr w:type="gramStart"/>
       <w:r>
         <w:rPr>
           <w:rFonts w:ascii="Times New Roman CYR" w:hAnsi="Times New Roman CYR"/>
           <w:sz w:val="24"/>
           <w:szCs w:val="24"/>
-        </w:rPr>
-        <w:t>Представитель {{representative_organization}}</w:t>
+          <w:lang w:val="en-US"/>
+        </w:rPr>
+        <w:t>}}</w:t>
       </w:r>
       <w:r>
         <w:rPr>
@@ -2119,6 +2316,25 @@
           <w:sz w:val="24"/>
           <w:szCs w:val="24"/>
         </w:rPr>
+        <w:t>Представитель</w:t>
+      </w:r>
+      <w:proofErr w:type="gramEnd"/>
+      <w:r>
+        <w:rPr>
+          <w:rFonts w:ascii="Times New Roman CYR" w:hAnsi="Times New Roman CYR"/>
+          <w:sz w:val="24"/>
+          <w:szCs w:val="24"/>
+          <w:lang w:val="en-US"/>
+        </w:rPr>
+        <w:t xml:space="preserve"> {{representative_organization}}</w:t>
+      </w:r>
+      <w:r>
+        <w:rPr>
+          <w:rFonts w:ascii="Times New Roman CYR" w:hAnsi="Times New Roman CYR"/>
+          <w:sz w:val="24"/>
+          <w:szCs w:val="24"/>
+          <w:lang w:val="en-US"/>
+        </w:rPr>
         <w:tab/>
       </w:r>
       <w:r>
@@ -2126,19 +2342,47 @@
           <w:rFonts w:ascii="Times New Roman CYR" w:hAnsi="Times New Roman CYR"/>
           <w:sz w:val="24"/>
           <w:szCs w:val="24"/>
-        </w:rPr>
-        <w:t>{{representative_name}}</w:t>
-      </w:r>
+          <w:lang w:val="en-US"/>
+        </w:rPr>
+        <w:t>{{representative_name</w:t>
+      </w:r>
+      <w:proofErr w:type="gramStart"/>
       <w:r>
         <w:rPr>
           <w:rFonts w:ascii="Times New Roman CYR" w:hAnsi="Times New Roman CYR"/>
           <w:sz w:val="24"/>
           <w:szCs w:val="24"/>
-        </w:rPr>
-        <w:t>{{/representative_signature}}</w:t>
+          <w:lang w:val="en-US"/>
+        </w:rPr>
+        <w:t>}}</w:t>
+      </w:r>
+      <w:r>
+        <w:rPr>
+          <w:rFonts w:ascii="Times New Roman CYR" w:hAnsi="Times New Roman CYR"/>
+          <w:sz w:val="24"/>
+          <w:szCs w:val="24"/>
+          <w:lang w:val="en-US"/>
+        </w:rPr>
+        <w:t>{</w:t>
+      </w:r>
+      <w:proofErr w:type="gramEnd"/>
+      <w:r>
+        <w:rPr>
+          <w:rFonts w:ascii="Times New Roman CYR" w:hAnsi="Times New Roman CYR"/>
+          <w:sz w:val="24"/>
+          <w:szCs w:val="24"/>
+          <w:lang w:val="en-US"/>
+        </w:rPr>
+        <w:t>{/representative_signature}}</w:t>
       </w:r>
     </w:p>
-    <w:p/>
+    <w:p>
+      <w:pPr>
+        <w:rPr>
+          <w:lang w:val="en-US"/>
+        </w:rPr>
+      </w:pPr>
+    </w:p>
     <w:sectPr>
       <w:pgSz w:w="11906" w:h="16838"/>
       <w:pgMar w:top="0" w:right="424" w:bottom="0" w:left="720" w:header="708" w:footer="708" w:gutter="0"/>

</xml_diff>

<commit_message>
Change dirrectory to save temporary files when gennerator works and cpmpressed their
</commit_message>
<xml_diff>
--- a/templates/act_check.docx
+++ b/templates/act_check.docx
@@ -329,7 +329,25 @@
                       <w:sz w:val="24"/>
                       <w:szCs w:val="24"/>
                     </w:rPr>
-                    <w:t>{{substation_name}}</w:t>
+                    <w:t>{{</w:t>
+                  </w:r>
+                  <w:proofErr w:type="spellStart"/>
+                  <w:r>
+                    <w:rPr>
+                      <w:b/>
+                      <w:sz w:val="24"/>
+                      <w:szCs w:val="24"/>
+                    </w:rPr>
+                    <w:t>substation_name</w:t>
+                  </w:r>
+                  <w:proofErr w:type="spellEnd"/>
+                  <w:r>
+                    <w:rPr>
+                      <w:b/>
+                      <w:sz w:val="24"/>
+                      <w:szCs w:val="24"/>
+                    </w:rPr>
+                    <w:t>}}</w:t>
                   </w:r>
                 </w:p>
                 <w:p>
@@ -348,7 +366,25 @@
                       <w:sz w:val="24"/>
                       <w:szCs w:val="24"/>
                     </w:rPr>
-                    <w:t>{{area_name}}</w:t>
+                    <w:t>{{</w:t>
+                  </w:r>
+                  <w:proofErr w:type="spellStart"/>
+                  <w:r>
+                    <w:rPr>
+                      <w:b/>
+                      <w:sz w:val="24"/>
+                      <w:szCs w:val="24"/>
+                    </w:rPr>
+                    <w:t>area_name</w:t>
+                  </w:r>
+                  <w:proofErr w:type="spellEnd"/>
+                  <w:r>
+                    <w:rPr>
+                      <w:b/>
+                      <w:sz w:val="24"/>
+                      <w:szCs w:val="24"/>
+                    </w:rPr>
+                    <w:t>}}</w:t>
                   </w:r>
                 </w:p>
                 <w:p>
@@ -458,7 +494,23 @@
           <w:sz w:val="24"/>
           <w:szCs w:val="24"/>
         </w:rPr>
-        <w:t>{{day}}</w:t>
+        <w:t>{{</w:t>
+      </w:r>
+      <w:proofErr w:type="spellStart"/>
+      <w:r>
+        <w:rPr>
+          <w:sz w:val="24"/>
+          <w:szCs w:val="24"/>
+        </w:rPr>
+        <w:t>day</w:t>
+      </w:r>
+      <w:proofErr w:type="spellEnd"/>
+      <w:r>
+        <w:rPr>
+          <w:sz w:val="24"/>
+          <w:szCs w:val="24"/>
+        </w:rPr>
+        <w:t>}}</w:t>
       </w:r>
       <w:r>
         <w:rPr>
@@ -479,7 +531,39 @@
           <w:sz w:val="24"/>
           <w:szCs w:val="24"/>
         </w:rPr>
-        <w:t>{{month}} {{year}}</w:t>
+        <w:t>{{</w:t>
+      </w:r>
+      <w:proofErr w:type="spellStart"/>
+      <w:r>
+        <w:rPr>
+          <w:sz w:val="24"/>
+          <w:szCs w:val="24"/>
+        </w:rPr>
+        <w:t>month</w:t>
+      </w:r>
+      <w:proofErr w:type="spellEnd"/>
+      <w:r>
+        <w:rPr>
+          <w:sz w:val="24"/>
+          <w:szCs w:val="24"/>
+        </w:rPr>
+        <w:t>}} {{</w:t>
+      </w:r>
+      <w:proofErr w:type="spellStart"/>
+      <w:r>
+        <w:rPr>
+          <w:sz w:val="24"/>
+          <w:szCs w:val="24"/>
+        </w:rPr>
+        <w:t>year</w:t>
+      </w:r>
+      <w:proofErr w:type="spellEnd"/>
+      <w:r>
+        <w:rPr>
+          <w:sz w:val="24"/>
+          <w:szCs w:val="24"/>
+        </w:rPr>
+        <w:t>}}</w:t>
       </w:r>
       <w:r>
         <w:rPr>
@@ -509,14 +593,62 @@
           <w:sz w:val="24"/>
           <w:szCs w:val="24"/>
         </w:rPr>
-        <w:t>Представитель ТОО «Межрегионэнерготранзит» {{employee_position}} {{employee_name}}</w:t>
-      </w:r>
-      <w:r>
-        <w:rPr>
-          <w:sz w:val="24"/>
-          <w:szCs w:val="24"/>
-        </w:rPr>
-        <w:t>{{/with_representatives}}</w:t>
+        <w:t>Представитель ТОО «Межрегионэнерготранзит» {{</w:t>
+      </w:r>
+      <w:proofErr w:type="spellStart"/>
+      <w:r>
+        <w:rPr>
+          <w:sz w:val="24"/>
+          <w:szCs w:val="24"/>
+        </w:rPr>
+        <w:t>employee_position</w:t>
+      </w:r>
+      <w:proofErr w:type="spellEnd"/>
+      <w:r>
+        <w:rPr>
+          <w:sz w:val="24"/>
+          <w:szCs w:val="24"/>
+        </w:rPr>
+        <w:t>}} {{</w:t>
+      </w:r>
+      <w:proofErr w:type="spellStart"/>
+      <w:r>
+        <w:rPr>
+          <w:sz w:val="24"/>
+          <w:szCs w:val="24"/>
+        </w:rPr>
+        <w:t>employee_name</w:t>
+      </w:r>
+      <w:proofErr w:type="spellEnd"/>
+      <w:r>
+        <w:rPr>
+          <w:sz w:val="24"/>
+          <w:szCs w:val="24"/>
+        </w:rPr>
+        <w:t>}}</w:t>
+      </w:r>
+      <w:r>
+        <w:rPr>
+          <w:sz w:val="24"/>
+          <w:szCs w:val="24"/>
+        </w:rPr>
+        <w:t>{{/</w:t>
+      </w:r>
+      <w:proofErr w:type="spellStart"/>
+      <w:r>
+        <w:rPr>
+          <w:sz w:val="24"/>
+          <w:szCs w:val="24"/>
+        </w:rPr>
+        <w:t>with_representatives</w:t>
+      </w:r>
+      <w:proofErr w:type="spellEnd"/>
+      <w:r>
+        <w:rPr>
+          <w:sz w:val="24"/>
+          <w:szCs w:val="24"/>
+        </w:rPr>
+        <w:t>}}</w:t>
       </w:r>
     </w:p>
     <w:p>
@@ -597,7 +729,25 @@
           <w:szCs w:val="24"/>
           <w:lang w:val="en-US"/>
         </w:rPr>
-        <w:t xml:space="preserve"> {{/with_representatives}}</w:t>
+        <w:t xml:space="preserve"> {{/</w:t>
+      </w:r>
+      <w:proofErr w:type="spellStart"/>
+      <w:r>
+        <w:rPr>
+          <w:sz w:val="24"/>
+          <w:szCs w:val="24"/>
+          <w:lang w:val="en-US"/>
+        </w:rPr>
+        <w:t>with_representatives</w:t>
+      </w:r>
+      <w:proofErr w:type="spellEnd"/>
+      <w:r>
+        <w:rPr>
+          <w:sz w:val="24"/>
+          <w:szCs w:val="24"/>
+          <w:lang w:val="en-US"/>
+        </w:rPr>
+        <w:t>}}</w:t>
       </w:r>
     </w:p>
     <w:p>
@@ -641,8 +791,36 @@
           <w:szCs w:val="24"/>
           <w:lang w:val="en-US"/>
         </w:rPr>
-        <w:t>{representative_organization}} {{representative_position}} {{representative_name</w:t>
-      </w:r>
+        <w:t>{representative_organization}} {{</w:t>
+      </w:r>
+      <w:proofErr w:type="spellStart"/>
+      <w:r>
+        <w:rPr>
+          <w:sz w:val="24"/>
+          <w:szCs w:val="24"/>
+          <w:lang w:val="en-US"/>
+        </w:rPr>
+        <w:t>representative_position</w:t>
+      </w:r>
+      <w:proofErr w:type="spellEnd"/>
+      <w:r>
+        <w:rPr>
+          <w:sz w:val="24"/>
+          <w:szCs w:val="24"/>
+          <w:lang w:val="en-US"/>
+        </w:rPr>
+        <w:t>}} {{</w:t>
+      </w:r>
+      <w:proofErr w:type="spellStart"/>
+      <w:r>
+        <w:rPr>
+          <w:sz w:val="24"/>
+          <w:szCs w:val="24"/>
+          <w:lang w:val="en-US"/>
+        </w:rPr>
+        <w:t>representative_name</w:t>
+      </w:r>
+      <w:proofErr w:type="spellEnd"/>
       <w:proofErr w:type="gramStart"/>
       <w:r>
         <w:rPr>
@@ -667,7 +845,25 @@
           <w:szCs w:val="24"/>
           <w:lang w:val="en-US"/>
         </w:rPr>
-        <w:t>{/representatives_top}}</w:t>
+        <w:t>{/</w:t>
+      </w:r>
+      <w:proofErr w:type="spellStart"/>
+      <w:r>
+        <w:rPr>
+          <w:sz w:val="24"/>
+          <w:szCs w:val="24"/>
+          <w:lang w:val="en-US"/>
+        </w:rPr>
+        <w:t>representatives_top</w:t>
+      </w:r>
+      <w:proofErr w:type="spellEnd"/>
+      <w:r>
+        <w:rPr>
+          <w:sz w:val="24"/>
+          <w:szCs w:val="24"/>
+          <w:lang w:val="en-US"/>
+        </w:rPr>
+        <w:t>}}</w:t>
       </w:r>
     </w:p>
     <w:p>
@@ -690,7 +886,23 @@
           <w:sz w:val="24"/>
           <w:szCs w:val="24"/>
         </w:rPr>
-        <w:t>{{work_schedule_type}}</w:t>
+        <w:t>{{</w:t>
+      </w:r>
+      <w:proofErr w:type="spellStart"/>
+      <w:r>
+        <w:rPr>
+          <w:sz w:val="24"/>
+          <w:szCs w:val="24"/>
+        </w:rPr>
+        <w:t>work_schedule_type</w:t>
+      </w:r>
+      <w:proofErr w:type="spellEnd"/>
+      <w:r>
+        <w:rPr>
+          <w:sz w:val="24"/>
+          <w:szCs w:val="24"/>
+        </w:rPr>
+        <w:t>}}</w:t>
       </w:r>
       <w:r>
         <w:rPr>
@@ -739,8 +951,17 @@
           <w:sz w:val="24"/>
           <w:szCs w:val="24"/>
         </w:rPr>
-        <w:t>{{voltage</w:t>
-      </w:r>
+        <w:t>{{</w:t>
+      </w:r>
+      <w:proofErr w:type="spellStart"/>
+      <w:r>
+        <w:rPr>
+          <w:sz w:val="24"/>
+          <w:szCs w:val="24"/>
+        </w:rPr>
+        <w:t>voltage</w:t>
+      </w:r>
+      <w:proofErr w:type="spellEnd"/>
       <w:proofErr w:type="gramStart"/>
       <w:r>
         <w:rPr>
@@ -749,6 +970,7 @@
         </w:rPr>
         <w:t>}}</w:t>
       </w:r>
+      <w:proofErr w:type="spellStart"/>
       <w:r>
         <w:rPr>
           <w:sz w:val="24"/>
@@ -764,6 +986,7 @@
         </w:rPr>
         <w:t>.</w:t>
       </w:r>
+      <w:proofErr w:type="spellEnd"/>
     </w:p>
     <w:p>
       <w:pPr>
@@ -809,7 +1032,27 @@
           <w:szCs w:val="24"/>
           <w:lang w:val="en-US"/>
         </w:rPr>
-        <w:t>{{connection_name}}</w:t>
+        <w:t>{{</w:t>
+      </w:r>
+      <w:proofErr w:type="spellStart"/>
+      <w:r>
+        <w:rPr>
+          <w:b/>
+          <w:sz w:val="24"/>
+          <w:szCs w:val="24"/>
+          <w:lang w:val="en-US"/>
+        </w:rPr>
+        <w:t>connection_name</w:t>
+      </w:r>
+      <w:proofErr w:type="spellEnd"/>
+      <w:r>
+        <w:rPr>
+          <w:b/>
+          <w:sz w:val="24"/>
+          <w:szCs w:val="24"/>
+          <w:lang w:val="en-US"/>
+        </w:rPr>
+        <w:t>}}</w:t>
       </w:r>
       <w:r>
         <w:rPr>
@@ -821,6 +1064,7 @@
         </w:rPr>
         <w:tab/>
       </w:r>
+      <w:proofErr w:type="spellStart"/>
       <w:r>
         <w:rPr>
           <w:b/>
@@ -830,6 +1074,7 @@
         </w:rPr>
         <w:t>Ктт</w:t>
       </w:r>
+      <w:proofErr w:type="spellEnd"/>
       <w:r>
         <w:rPr>
           <w:b/>
@@ -848,7 +1093,29 @@
           <w:szCs w:val="24"/>
           <w:lang w:val="en-US"/>
         </w:rPr>
-        <w:t>{{ct_ratio}}</w:t>
+        <w:t>{{</w:t>
+      </w:r>
+      <w:proofErr w:type="spellStart"/>
+      <w:r>
+        <w:rPr>
+          <w:b/>
+          <w:bCs/>
+          <w:sz w:val="24"/>
+          <w:szCs w:val="24"/>
+          <w:lang w:val="en-US"/>
+        </w:rPr>
+        <w:t>ct_ratio</w:t>
+      </w:r>
+      <w:proofErr w:type="spellEnd"/>
+      <w:r>
+        <w:rPr>
+          <w:b/>
+          <w:bCs/>
+          <w:sz w:val="24"/>
+          <w:szCs w:val="24"/>
+          <w:lang w:val="en-US"/>
+        </w:rPr>
+        <w:t>}}</w:t>
       </w:r>
     </w:p>
     <w:tbl>
@@ -889,12 +1156,14 @@
             <w:pPr>
               <w:jc w:val="center"/>
               <w:rPr>
-                <w:sz w:val="20"/>
+                <w:sz w:val="24"/>
+                <w:szCs w:val="24"/>
               </w:rPr>
             </w:pPr>
             <w:r>
               <w:rPr>
-                <w:sz w:val="20"/>
+                <w:sz w:val="24"/>
+                <w:szCs w:val="24"/>
               </w:rPr>
               <w:t>Тип прибора учета</w:t>
             </w:r>
@@ -916,12 +1185,14 @@
             <w:pPr>
               <w:jc w:val="center"/>
               <w:rPr>
-                <w:sz w:val="20"/>
+                <w:sz w:val="24"/>
+                <w:szCs w:val="24"/>
               </w:rPr>
             </w:pPr>
             <w:r>
               <w:rPr>
-                <w:sz w:val="20"/>
+                <w:sz w:val="24"/>
+                <w:szCs w:val="24"/>
               </w:rPr>
               <w:t>Заводской номер</w:t>
             </w:r>
@@ -944,12 +1215,14 @@
             <w:pPr>
               <w:jc w:val="center"/>
               <w:rPr>
-                <w:sz w:val="20"/>
+                <w:sz w:val="24"/>
+                <w:szCs w:val="24"/>
               </w:rPr>
             </w:pPr>
             <w:r>
               <w:rPr>
-                <w:sz w:val="20"/>
+                <w:sz w:val="24"/>
+                <w:szCs w:val="24"/>
               </w:rPr>
               <w:t>Показания</w:t>
             </w:r>
@@ -971,12 +1244,14 @@
             <w:pPr>
               <w:jc w:val="center"/>
               <w:rPr>
-                <w:sz w:val="20"/>
+                <w:sz w:val="24"/>
+                <w:szCs w:val="24"/>
               </w:rPr>
             </w:pPr>
             <w:r>
               <w:rPr>
-                <w:sz w:val="20"/>
+                <w:sz w:val="24"/>
+                <w:szCs w:val="24"/>
               </w:rPr>
               <w:t>Класс точности</w:t>
             </w:r>
@@ -998,12 +1273,14 @@
             <w:pPr>
               <w:jc w:val="center"/>
               <w:rPr>
-                <w:sz w:val="20"/>
+                <w:sz w:val="24"/>
+                <w:szCs w:val="24"/>
               </w:rPr>
             </w:pPr>
             <w:r>
               <w:rPr>
-                <w:sz w:val="20"/>
+                <w:sz w:val="24"/>
+                <w:szCs w:val="24"/>
               </w:rPr>
               <w:t>Год поверки</w:t>
             </w:r>
@@ -1032,7 +1309,15 @@
               <w:jc w:val="center"/>
             </w:pPr>
             <w:r>
-              <w:t>{{meter_name}}</w:t>
+              <w:t>{{</w:t>
+            </w:r>
+            <w:proofErr w:type="spellStart"/>
+            <w:r>
+              <w:t>meter_name</w:t>
+            </w:r>
+            <w:proofErr w:type="spellEnd"/>
+            <w:r>
+              <w:t>}}</w:t>
             </w:r>
           </w:p>
         </w:tc>
@@ -1054,7 +1339,15 @@
               <w:jc w:val="center"/>
             </w:pPr>
             <w:r>
-              <w:t>{{meter_serial}}</w:t>
+              <w:t>{{</w:t>
+            </w:r>
+            <w:proofErr w:type="spellStart"/>
+            <w:r>
+              <w:t>meter_serial</w:t>
+            </w:r>
+            <w:proofErr w:type="spellEnd"/>
+            <w:r>
+              <w:t>}}</w:t>
             </w:r>
           </w:p>
         </w:tc>
@@ -1108,7 +1401,23 @@
                 <w:sz w:val="22"/>
                 <w:szCs w:val="22"/>
               </w:rPr>
-              <w:t>{{reading_a_plus}}</w:t>
+              <w:t>{{</w:t>
+            </w:r>
+            <w:proofErr w:type="spellStart"/>
+            <w:r>
+              <w:rPr>
+                <w:sz w:val="22"/>
+                <w:szCs w:val="22"/>
+              </w:rPr>
+              <w:t>reading_a_plus</w:t>
+            </w:r>
+            <w:proofErr w:type="spellEnd"/>
+            <w:r>
+              <w:rPr>
+                <w:sz w:val="22"/>
+                <w:szCs w:val="22"/>
+              </w:rPr>
+              <w:t>}}</w:t>
             </w:r>
           </w:p>
         </w:tc>
@@ -1130,7 +1439,15 @@
               <w:jc w:val="center"/>
             </w:pPr>
             <w:r>
-              <w:t>{{accuracy}}</w:t>
+              <w:t>{{</w:t>
+            </w:r>
+            <w:proofErr w:type="spellStart"/>
+            <w:r>
+              <w:t>accuracy</w:t>
+            </w:r>
+            <w:proofErr w:type="spellEnd"/>
+            <w:r>
+              <w:t>}}</w:t>
             </w:r>
           </w:p>
         </w:tc>
@@ -1152,7 +1469,15 @@
               <w:jc w:val="center"/>
             </w:pPr>
             <w:r>
-              <w:t>{{verify}}</w:t>
+              <w:t>{{</w:t>
+            </w:r>
+            <w:proofErr w:type="spellStart"/>
+            <w:r>
+              <w:t>verify</w:t>
+            </w:r>
+            <w:proofErr w:type="spellEnd"/>
+            <w:r>
+              <w:t>}}</w:t>
             </w:r>
           </w:p>
         </w:tc>
@@ -1241,7 +1566,23 @@
                 <w:sz w:val="22"/>
                 <w:szCs w:val="22"/>
               </w:rPr>
-              <w:t>{{reading_a_minus}}</w:t>
+              <w:t>{{</w:t>
+            </w:r>
+            <w:proofErr w:type="spellStart"/>
+            <w:r>
+              <w:rPr>
+                <w:sz w:val="22"/>
+                <w:szCs w:val="22"/>
+              </w:rPr>
+              <w:t>reading_a_minus</w:t>
+            </w:r>
+            <w:proofErr w:type="spellEnd"/>
+            <w:r>
+              <w:rPr>
+                <w:sz w:val="22"/>
+                <w:szCs w:val="22"/>
+              </w:rPr>
+              <w:t>}}</w:t>
             </w:r>
           </w:p>
         </w:tc>
@@ -1360,7 +1701,23 @@
                 <w:sz w:val="22"/>
                 <w:szCs w:val="22"/>
               </w:rPr>
-              <w:t>{{reading_r_plus}}</w:t>
+              <w:t>{{</w:t>
+            </w:r>
+            <w:proofErr w:type="spellStart"/>
+            <w:r>
+              <w:rPr>
+                <w:sz w:val="22"/>
+                <w:szCs w:val="22"/>
+              </w:rPr>
+              <w:t>reading_r_plus</w:t>
+            </w:r>
+            <w:proofErr w:type="spellEnd"/>
+            <w:r>
+              <w:rPr>
+                <w:sz w:val="22"/>
+                <w:szCs w:val="22"/>
+              </w:rPr>
+              <w:t>}}</w:t>
             </w:r>
           </w:p>
         </w:tc>
@@ -1479,7 +1836,23 @@
                 <w:sz w:val="22"/>
                 <w:szCs w:val="22"/>
               </w:rPr>
-              <w:t>{{reading_r_minus}}</w:t>
+              <w:t>{{</w:t>
+            </w:r>
+            <w:proofErr w:type="spellStart"/>
+            <w:r>
+              <w:rPr>
+                <w:sz w:val="22"/>
+                <w:szCs w:val="22"/>
+              </w:rPr>
+              <w:t>reading_r_minus</w:t>
+            </w:r>
+            <w:proofErr w:type="spellEnd"/>
+            <w:r>
+              <w:rPr>
+                <w:sz w:val="22"/>
+                <w:szCs w:val="22"/>
+              </w:rPr>
+              <w:t>}}</w:t>
             </w:r>
           </w:p>
         </w:tc>
@@ -1607,6 +1980,7 @@
                 <w:szCs w:val="24"/>
               </w:rPr>
             </w:pPr>
+            <w:proofErr w:type="spellStart"/>
             <w:proofErr w:type="gramStart"/>
             <w:r>
               <w:rPr>
@@ -1623,6 +1997,7 @@
               </w:rPr>
               <w:t>а</w:t>
             </w:r>
+            <w:proofErr w:type="spellEnd"/>
           </w:p>
         </w:tc>
         <w:tc>
@@ -1646,6 +2021,7 @@
                 <w:szCs w:val="24"/>
               </w:rPr>
             </w:pPr>
+            <w:proofErr w:type="spellStart"/>
             <w:proofErr w:type="gramStart"/>
             <w:r>
               <w:rPr>
@@ -1662,6 +2038,7 @@
               </w:rPr>
               <w:t>в</w:t>
             </w:r>
+            <w:proofErr w:type="spellEnd"/>
           </w:p>
         </w:tc>
         <w:tc>
@@ -1685,6 +2062,7 @@
                 <w:szCs w:val="24"/>
               </w:rPr>
             </w:pPr>
+            <w:proofErr w:type="spellStart"/>
             <w:proofErr w:type="gramStart"/>
             <w:r>
               <w:rPr>
@@ -1701,6 +2079,7 @@
               </w:rPr>
               <w:t>с</w:t>
             </w:r>
+            <w:proofErr w:type="spellEnd"/>
           </w:p>
         </w:tc>
       </w:tr>
@@ -1739,7 +2118,23 @@
                 <w:sz w:val="24"/>
                 <w:szCs w:val="24"/>
               </w:rPr>
-              <w:t>{{ia}}</w:t>
+              <w:t>{{</w:t>
+            </w:r>
+            <w:proofErr w:type="spellStart"/>
+            <w:r>
+              <w:rPr>
+                <w:sz w:val="24"/>
+                <w:szCs w:val="24"/>
+              </w:rPr>
+              <w:t>ia</w:t>
+            </w:r>
+            <w:proofErr w:type="spellEnd"/>
+            <w:r>
+              <w:rPr>
+                <w:sz w:val="24"/>
+                <w:szCs w:val="24"/>
+              </w:rPr>
+              <w:t>}}</w:t>
             </w:r>
             <w:r>
               <w:rPr>
@@ -1781,7 +2176,23 @@
                 <w:sz w:val="24"/>
                 <w:szCs w:val="24"/>
               </w:rPr>
-              <w:t>{{angle_a}}</w:t>
+              <w:t>{{</w:t>
+            </w:r>
+            <w:proofErr w:type="spellStart"/>
+            <w:r>
+              <w:rPr>
+                <w:sz w:val="24"/>
+                <w:szCs w:val="24"/>
+              </w:rPr>
+              <w:t>angle_a</w:t>
+            </w:r>
+            <w:proofErr w:type="spellEnd"/>
+            <w:r>
+              <w:rPr>
+                <w:sz w:val="24"/>
+                <w:szCs w:val="24"/>
+              </w:rPr>
+              <w:t>}}</w:t>
             </w:r>
             <w:r>
               <w:rPr>
@@ -1795,7 +2206,23 @@
                 <w:sz w:val="24"/>
                 <w:szCs w:val="24"/>
               </w:rPr>
-              <w:t>{{type_a}}</w:t>
+              <w:t>{{</w:t>
+            </w:r>
+            <w:proofErr w:type="spellStart"/>
+            <w:r>
+              <w:rPr>
+                <w:sz w:val="24"/>
+                <w:szCs w:val="24"/>
+              </w:rPr>
+              <w:t>type_a</w:t>
+            </w:r>
+            <w:proofErr w:type="spellEnd"/>
+            <w:r>
+              <w:rPr>
+                <w:sz w:val="24"/>
+                <w:szCs w:val="24"/>
+              </w:rPr>
+              <w:t>}}</w:t>
             </w:r>
           </w:p>
         </w:tc>
@@ -1833,7 +2260,23 @@
                 <w:sz w:val="24"/>
                 <w:szCs w:val="24"/>
               </w:rPr>
-              <w:t>{{ib}}</w:t>
+              <w:t>{{</w:t>
+            </w:r>
+            <w:proofErr w:type="spellStart"/>
+            <w:r>
+              <w:rPr>
+                <w:sz w:val="24"/>
+                <w:szCs w:val="24"/>
+              </w:rPr>
+              <w:t>ib</w:t>
+            </w:r>
+            <w:proofErr w:type="spellEnd"/>
+            <w:r>
+              <w:rPr>
+                <w:sz w:val="24"/>
+                <w:szCs w:val="24"/>
+              </w:rPr>
+              <w:t>}}</w:t>
             </w:r>
             <w:r>
               <w:rPr>
@@ -1875,7 +2318,23 @@
                 <w:sz w:val="24"/>
                 <w:szCs w:val="24"/>
               </w:rPr>
-              <w:t>{{angle_b}}</w:t>
+              <w:t>{{</w:t>
+            </w:r>
+            <w:proofErr w:type="spellStart"/>
+            <w:r>
+              <w:rPr>
+                <w:sz w:val="24"/>
+                <w:szCs w:val="24"/>
+              </w:rPr>
+              <w:t>angle_b</w:t>
+            </w:r>
+            <w:proofErr w:type="spellEnd"/>
+            <w:r>
+              <w:rPr>
+                <w:sz w:val="24"/>
+                <w:szCs w:val="24"/>
+              </w:rPr>
+              <w:t>}}</w:t>
             </w:r>
             <w:r>
               <w:rPr>
@@ -1889,7 +2348,23 @@
                 <w:sz w:val="24"/>
                 <w:szCs w:val="24"/>
               </w:rPr>
-              <w:t>{{type_b}}</w:t>
+              <w:t>{{</w:t>
+            </w:r>
+            <w:proofErr w:type="spellStart"/>
+            <w:r>
+              <w:rPr>
+                <w:sz w:val="24"/>
+                <w:szCs w:val="24"/>
+              </w:rPr>
+              <w:t>type_b</w:t>
+            </w:r>
+            <w:proofErr w:type="spellEnd"/>
+            <w:r>
+              <w:rPr>
+                <w:sz w:val="24"/>
+                <w:szCs w:val="24"/>
+              </w:rPr>
+              <w:t>}}</w:t>
             </w:r>
           </w:p>
         </w:tc>
@@ -1924,7 +2399,23 @@
                 <w:sz w:val="24"/>
                 <w:szCs w:val="24"/>
               </w:rPr>
-              <w:t>{{ic}}</w:t>
+              <w:t>{{</w:t>
+            </w:r>
+            <w:proofErr w:type="spellStart"/>
+            <w:r>
+              <w:rPr>
+                <w:sz w:val="24"/>
+                <w:szCs w:val="24"/>
+              </w:rPr>
+              <w:t>ic</w:t>
+            </w:r>
+            <w:proofErr w:type="spellEnd"/>
+            <w:r>
+              <w:rPr>
+                <w:sz w:val="24"/>
+                <w:szCs w:val="24"/>
+              </w:rPr>
+              <w:t>}}</w:t>
             </w:r>
             <w:r>
               <w:rPr>
@@ -1966,7 +2457,23 @@
                 <w:sz w:val="24"/>
                 <w:szCs w:val="24"/>
               </w:rPr>
-              <w:t>{{angle_c}}</w:t>
+              <w:t>{{</w:t>
+            </w:r>
+            <w:proofErr w:type="spellStart"/>
+            <w:r>
+              <w:rPr>
+                <w:sz w:val="24"/>
+                <w:szCs w:val="24"/>
+              </w:rPr>
+              <w:t>angle_c</w:t>
+            </w:r>
+            <w:proofErr w:type="spellEnd"/>
+            <w:r>
+              <w:rPr>
+                <w:sz w:val="24"/>
+                <w:szCs w:val="24"/>
+              </w:rPr>
+              <w:t>}}</w:t>
             </w:r>
             <w:r>
               <w:rPr>
@@ -1980,7 +2487,23 @@
                 <w:sz w:val="24"/>
                 <w:szCs w:val="24"/>
               </w:rPr>
-              <w:t>{{type_c}}</w:t>
+              <w:t>{{</w:t>
+            </w:r>
+            <w:proofErr w:type="spellStart"/>
+            <w:r>
+              <w:rPr>
+                <w:sz w:val="24"/>
+                <w:szCs w:val="24"/>
+              </w:rPr>
+              <w:t>type_c</w:t>
+            </w:r>
+            <w:proofErr w:type="spellEnd"/>
+            <w:r>
+              <w:rPr>
+                <w:sz w:val="24"/>
+                <w:szCs w:val="24"/>
+              </w:rPr>
+              <w:t>}}</w:t>
             </w:r>
           </w:p>
         </w:tc>
@@ -2011,47 +2534,136 @@
         </w:rPr>
         <w:t xml:space="preserve">Напряжение: </w:t>
       </w:r>
-      <w:r>
-        <w:rPr>
-          <w:sz w:val="24"/>
-          <w:szCs w:val="24"/>
-        </w:rPr>
-        <w:t xml:space="preserve">Uab = </w:t>
-      </w:r>
-      <w:r>
-        <w:rPr>
-          <w:sz w:val="24"/>
-          <w:szCs w:val="24"/>
-        </w:rPr>
-        <w:t>{{uab}}</w:t>
-      </w:r>
-      <w:r>
-        <w:rPr>
-          <w:sz w:val="24"/>
-          <w:szCs w:val="24"/>
-        </w:rPr>
-        <w:t xml:space="preserve"> В; Ubc = </w:t>
-      </w:r>
-      <w:r>
-        <w:rPr>
-          <w:sz w:val="24"/>
-          <w:szCs w:val="24"/>
-        </w:rPr>
-        <w:t>{{ubc}}</w:t>
-      </w:r>
-      <w:r>
-        <w:rPr>
-          <w:sz w:val="24"/>
-          <w:szCs w:val="24"/>
-        </w:rPr>
-        <w:t xml:space="preserve"> В; Uca = </w:t>
-      </w:r>
-      <w:r>
-        <w:rPr>
-          <w:sz w:val="24"/>
-          <w:szCs w:val="24"/>
-        </w:rPr>
-        <w:t>{{uca}}</w:t>
+      <w:proofErr w:type="spellStart"/>
+      <w:r>
+        <w:rPr>
+          <w:sz w:val="24"/>
+          <w:szCs w:val="24"/>
+        </w:rPr>
+        <w:t>Uab</w:t>
+      </w:r>
+      <w:proofErr w:type="spellEnd"/>
+      <w:r>
+        <w:rPr>
+          <w:sz w:val="24"/>
+          <w:szCs w:val="24"/>
+        </w:rPr>
+        <w:t xml:space="preserve"> = </w:t>
+      </w:r>
+      <w:r>
+        <w:rPr>
+          <w:sz w:val="24"/>
+          <w:szCs w:val="24"/>
+        </w:rPr>
+        <w:t>{{</w:t>
+      </w:r>
+      <w:proofErr w:type="spellStart"/>
+      <w:r>
+        <w:rPr>
+          <w:sz w:val="24"/>
+          <w:szCs w:val="24"/>
+        </w:rPr>
+        <w:t>uab</w:t>
+      </w:r>
+      <w:proofErr w:type="spellEnd"/>
+      <w:r>
+        <w:rPr>
+          <w:sz w:val="24"/>
+          <w:szCs w:val="24"/>
+        </w:rPr>
+        <w:t>}}</w:t>
+      </w:r>
+      <w:r>
+        <w:rPr>
+          <w:sz w:val="24"/>
+          <w:szCs w:val="24"/>
+        </w:rPr>
+        <w:t xml:space="preserve"> В; </w:t>
+      </w:r>
+      <w:proofErr w:type="spellStart"/>
+      <w:r>
+        <w:rPr>
+          <w:sz w:val="24"/>
+          <w:szCs w:val="24"/>
+        </w:rPr>
+        <w:t>Ubc</w:t>
+      </w:r>
+      <w:proofErr w:type="spellEnd"/>
+      <w:r>
+        <w:rPr>
+          <w:sz w:val="24"/>
+          <w:szCs w:val="24"/>
+        </w:rPr>
+        <w:t xml:space="preserve"> = </w:t>
+      </w:r>
+      <w:r>
+        <w:rPr>
+          <w:sz w:val="24"/>
+          <w:szCs w:val="24"/>
+        </w:rPr>
+        <w:t>{{</w:t>
+      </w:r>
+      <w:proofErr w:type="spellStart"/>
+      <w:r>
+        <w:rPr>
+          <w:sz w:val="24"/>
+          <w:szCs w:val="24"/>
+        </w:rPr>
+        <w:t>ubc</w:t>
+      </w:r>
+      <w:proofErr w:type="spellEnd"/>
+      <w:r>
+        <w:rPr>
+          <w:sz w:val="24"/>
+          <w:szCs w:val="24"/>
+        </w:rPr>
+        <w:t>}}</w:t>
+      </w:r>
+      <w:r>
+        <w:rPr>
+          <w:sz w:val="24"/>
+          <w:szCs w:val="24"/>
+        </w:rPr>
+        <w:t xml:space="preserve"> В; </w:t>
+      </w:r>
+      <w:proofErr w:type="spellStart"/>
+      <w:r>
+        <w:rPr>
+          <w:sz w:val="24"/>
+          <w:szCs w:val="24"/>
+        </w:rPr>
+        <w:t>Uca</w:t>
+      </w:r>
+      <w:proofErr w:type="spellEnd"/>
+      <w:r>
+        <w:rPr>
+          <w:sz w:val="24"/>
+          <w:szCs w:val="24"/>
+        </w:rPr>
+        <w:t xml:space="preserve"> = </w:t>
+      </w:r>
+      <w:r>
+        <w:rPr>
+          <w:sz w:val="24"/>
+          <w:szCs w:val="24"/>
+        </w:rPr>
+        <w:t>{{</w:t>
+      </w:r>
+      <w:proofErr w:type="spellStart"/>
+      <w:r>
+        <w:rPr>
+          <w:sz w:val="24"/>
+          <w:szCs w:val="24"/>
+        </w:rPr>
+        <w:t>uca</w:t>
+      </w:r>
+      <w:proofErr w:type="spellEnd"/>
+      <w:r>
+        <w:rPr>
+          <w:sz w:val="24"/>
+          <w:szCs w:val="24"/>
+        </w:rPr>
+        <w:t>}}</w:t>
       </w:r>
       <w:r>
         <w:rPr>
@@ -2075,7 +2687,25 @@
           <w:sz w:val="24"/>
           <w:szCs w:val="24"/>
         </w:rPr>
-        <w:t>{{/vector_diagram}}</w:t>
+        <w:t>{{/</w:t>
+      </w:r>
+      <w:proofErr w:type="spellStart"/>
+      <w:r>
+        <w:rPr>
+          <w:bCs/>
+          <w:sz w:val="24"/>
+          <w:szCs w:val="24"/>
+        </w:rPr>
+        <w:t>vector_diagram</w:t>
+      </w:r>
+      <w:proofErr w:type="spellEnd"/>
+      <w:r>
+        <w:rPr>
+          <w:bCs/>
+          <w:sz w:val="24"/>
+          <w:szCs w:val="24"/>
+        </w:rPr>
+        <w:t>}}</w:t>
       </w:r>
     </w:p>
     <w:p>
@@ -2115,7 +2745,39 @@
           <w:sz w:val="24"/>
           <w:szCs w:val="24"/>
         </w:rPr>
-        <w:t>{{reason}} {{result}}</w:t>
+        <w:t>{{</w:t>
+      </w:r>
+      <w:proofErr w:type="spellStart"/>
+      <w:r>
+        <w:rPr>
+          <w:sz w:val="24"/>
+          <w:szCs w:val="24"/>
+        </w:rPr>
+        <w:t>reason</w:t>
+      </w:r>
+      <w:proofErr w:type="spellEnd"/>
+      <w:r>
+        <w:rPr>
+          <w:sz w:val="24"/>
+          <w:szCs w:val="24"/>
+        </w:rPr>
+        <w:t>}} {{</w:t>
+      </w:r>
+      <w:proofErr w:type="spellStart"/>
+      <w:r>
+        <w:rPr>
+          <w:sz w:val="24"/>
+          <w:szCs w:val="24"/>
+        </w:rPr>
+        <w:t>result</w:t>
+      </w:r>
+      <w:proofErr w:type="spellEnd"/>
+      <w:r>
+        <w:rPr>
+          <w:sz w:val="24"/>
+          <w:szCs w:val="24"/>
+        </w:rPr>
+        <w:t>}}</w:t>
       </w:r>
       <w:r>
         <w:rPr>
@@ -2194,7 +2856,15 @@
           <w:sz w:val="24"/>
           <w:szCs w:val="24"/>
         </w:rPr>
-        <w:t>{{seal</w:t>
+        <w:t>{{</w:t>
+      </w:r>
+      <w:proofErr w:type="spellStart"/>
+      <w:r>
+        <w:rPr>
+          <w:sz w:val="24"/>
+          <w:szCs w:val="24"/>
+        </w:rPr>
+        <w:t>seal</w:t>
       </w:r>
       <w:r>
         <w:rPr>
@@ -2203,6 +2873,7 @@
         </w:rPr>
         <w:t>_number</w:t>
       </w:r>
+      <w:proofErr w:type="spellEnd"/>
       <w:r>
         <w:rPr>
           <w:sz w:val="24"/>
@@ -2248,8 +2919,9 @@
           <w:szCs w:val="24"/>
           <w:lang w:val="en-US"/>
         </w:rPr>
-        <w:t>{{employee_signature_title}}</w:t>
-      </w:r>
+        <w:t>{{</w:t>
+      </w:r>
+      <w:proofErr w:type="spellStart"/>
       <w:r>
         <w:rPr>
           <w:rFonts w:ascii="Times New Roman CYR" w:hAnsi="Times New Roman CYR"/>
@@ -2257,6 +2929,25 @@
           <w:szCs w:val="24"/>
           <w:lang w:val="en-US"/>
         </w:rPr>
+        <w:t>employee_signature_title</w:t>
+      </w:r>
+      <w:proofErr w:type="spellEnd"/>
+      <w:r>
+        <w:rPr>
+          <w:rFonts w:ascii="Times New Roman CYR" w:hAnsi="Times New Roman CYR"/>
+          <w:sz w:val="24"/>
+          <w:szCs w:val="24"/>
+          <w:lang w:val="en-US"/>
+        </w:rPr>
+        <w:t>}}</w:t>
+      </w:r>
+      <w:r>
+        <w:rPr>
+          <w:rFonts w:ascii="Times New Roman CYR" w:hAnsi="Times New Roman CYR"/>
+          <w:sz w:val="24"/>
+          <w:szCs w:val="24"/>
+          <w:lang w:val="en-US"/>
+        </w:rPr>
         <w:t xml:space="preserve"> </w:t>
       </w:r>
       <w:r>
@@ -2275,7 +2966,27 @@
           <w:szCs w:val="24"/>
           <w:lang w:val="en-US"/>
         </w:rPr>
-        <w:t>{{employee_name}}</w:t>
+        <w:t>{{</w:t>
+      </w:r>
+      <w:proofErr w:type="spellStart"/>
+      <w:r>
+        <w:rPr>
+          <w:rFonts w:ascii="Times New Roman CYR" w:hAnsi="Times New Roman CYR"/>
+          <w:sz w:val="24"/>
+          <w:szCs w:val="24"/>
+          <w:lang w:val="en-US"/>
+        </w:rPr>
+        <w:t>employee_name</w:t>
+      </w:r>
+      <w:proofErr w:type="spellEnd"/>
+      <w:r>
+        <w:rPr>
+          <w:rFonts w:ascii="Times New Roman CYR" w:hAnsi="Times New Roman CYR"/>
+          <w:sz w:val="24"/>
+          <w:szCs w:val="24"/>
+          <w:lang w:val="en-US"/>
+        </w:rPr>
+        <w:t>}}</w:t>
       </w:r>
     </w:p>
     <w:p>
@@ -2326,8 +3037,9 @@
           <w:szCs w:val="24"/>
           <w:lang w:val="en-US"/>
         </w:rPr>
-        <w:t xml:space="preserve"> {{representative_organization}}</w:t>
-      </w:r>
+        <w:t xml:space="preserve"> {{</w:t>
+      </w:r>
+      <w:proofErr w:type="spellStart"/>
       <w:r>
         <w:rPr>
           <w:rFonts w:ascii="Times New Roman CYR" w:hAnsi="Times New Roman CYR"/>
@@ -2335,6 +3047,25 @@
           <w:szCs w:val="24"/>
           <w:lang w:val="en-US"/>
         </w:rPr>
+        <w:t>representative_organization</w:t>
+      </w:r>
+      <w:proofErr w:type="spellEnd"/>
+      <w:r>
+        <w:rPr>
+          <w:rFonts w:ascii="Times New Roman CYR" w:hAnsi="Times New Roman CYR"/>
+          <w:sz w:val="24"/>
+          <w:szCs w:val="24"/>
+          <w:lang w:val="en-US"/>
+        </w:rPr>
+        <w:t>}}</w:t>
+      </w:r>
+      <w:r>
+        <w:rPr>
+          <w:rFonts w:ascii="Times New Roman CYR" w:hAnsi="Times New Roman CYR"/>
+          <w:sz w:val="24"/>
+          <w:szCs w:val="24"/>
+          <w:lang w:val="en-US"/>
+        </w:rPr>
         <w:tab/>
       </w:r>
       <w:r>
@@ -2344,8 +3075,19 @@
           <w:szCs w:val="24"/>
           <w:lang w:val="en-US"/>
         </w:rPr>
-        <w:t>{{representative_name</w:t>
-      </w:r>
+        <w:t>{{</w:t>
+      </w:r>
+      <w:proofErr w:type="spellStart"/>
+      <w:r>
+        <w:rPr>
+          <w:rFonts w:ascii="Times New Roman CYR" w:hAnsi="Times New Roman CYR"/>
+          <w:sz w:val="24"/>
+          <w:szCs w:val="24"/>
+          <w:lang w:val="en-US"/>
+        </w:rPr>
+        <w:t>representative_name</w:t>
+      </w:r>
+      <w:proofErr w:type="spellEnd"/>
       <w:proofErr w:type="gramStart"/>
       <w:r>
         <w:rPr>
@@ -2373,7 +3115,27 @@
           <w:szCs w:val="24"/>
           <w:lang w:val="en-US"/>
         </w:rPr>
-        <w:t>{/representative_signature}}</w:t>
+        <w:t>{/</w:t>
+      </w:r>
+      <w:proofErr w:type="spellStart"/>
+      <w:r>
+        <w:rPr>
+          <w:rFonts w:ascii="Times New Roman CYR" w:hAnsi="Times New Roman CYR"/>
+          <w:sz w:val="24"/>
+          <w:szCs w:val="24"/>
+          <w:lang w:val="en-US"/>
+        </w:rPr>
+        <w:t>representative_signature</w:t>
+      </w:r>
+      <w:proofErr w:type="spellEnd"/>
+      <w:r>
+        <w:rPr>
+          <w:rFonts w:ascii="Times New Roman CYR" w:hAnsi="Times New Roman CYR"/>
+          <w:sz w:val="24"/>
+          <w:szCs w:val="24"/>
+          <w:lang w:val="en-US"/>
+        </w:rPr>
+        <w:t>}}</w:t>
       </w:r>
     </w:p>
     <w:p>

</xml_diff>